<commit_message>
fpr cost function + some docx fixes
some docx fixes
also tried to check what happens if we add fpr to the cost function
</commit_message>
<xml_diff>
--- a/report/WordsThatHarm.docx
+++ b/report/WordsThatHarm.docx
@@ -75,42 +75,37 @@
           <w:sz w:val="24"/>
           <w:szCs w:val="24"/>
         </w:rPr>
-        <w:t>In this project w</w:t>
+        <w:t>We audit toxic-comment detectors on the Jigsaw 2018 dataset across three architectural families evaluated on the same data: a specialized BERT encoder (unitary/toxic-bert), a non-neural TF-IDF + linear-SVM baseline we train ourselves, a DistilGPT-2 decoder (zero-shot and fine-tuned), and a DistilBERT student trained via knowledge distillation from the encoder. Rather than chasing accuracy, we stress-test each model for identity bias, robustness to obfuscation, and the mechanism behind its errors. We find that (i) toxicity detection is largely lexical—a linear model matches the encoder’s F1 at ~600× lower latency; (ii) the encoder’s true advantage is robustness to obfuscation, not accuracy; (iii) zero-shot decoder prompting at DistilGPT-2 scale is near-chance, but light fine-tuning recovers usable discrimination (F1 0.59, ROC-AUC 0.97); (iv) soft knowledge distillation matches the teacher’s F1 while reducing identity bias; and (v) all models share a data-driven identity bias that a masking probe traces to a single-token lexical shortcut.</w:t>
       </w:r>
       <w:r>
         <w:rPr>
           <w:sz w:val="24"/>
           <w:szCs w:val="24"/>
         </w:rPr>
-        <w:t xml:space="preserve">e audit toxic-comment detectors on the Jigsaw 2018 dataset across three architectures evaluated on the same data: a specialized BERT encoder (unitary/toxic-bert), a non-neural TF-IDF + linear-SVM baseline we train, and a DistilGPT-2 decoder used as a classifier via prompting. </w:t>
       </w:r>
       <w:r>
         <w:rPr>
           <w:sz w:val="24"/>
           <w:szCs w:val="24"/>
         </w:rPr>
-        <w:t>W</w:t>
       </w:r>
       <w:r>
         <w:rPr>
           <w:sz w:val="24"/>
           <w:szCs w:val="24"/>
         </w:rPr>
-        <w:t xml:space="preserve">e stress-test each model for identity bias, robustness to obfuscation, and errors. </w:t>
       </w:r>
       <w:r>
         <w:rPr>
           <w:sz w:val="24"/>
           <w:szCs w:val="24"/>
         </w:rPr>
-        <w:t xml:space="preserve"> </w:t>
       </w:r>
       <w:r>
         <w:rPr>
           <w:sz w:val="24"/>
           <w:szCs w:val="24"/>
         </w:rPr>
-        <w:t>We find that (</w:t>
       </w:r>
       <w:proofErr w:type="spellStart"/>
       <w:r>
@@ -118,7 +113,6 @@
           <w:sz w:val="24"/>
           <w:szCs w:val="24"/>
         </w:rPr>
-        <w:t>i</w:t>
       </w:r>
       <w:proofErr w:type="spellEnd"/>
       <w:r>
@@ -126,42 +120,36 @@
           <w:sz w:val="24"/>
           <w:szCs w:val="24"/>
         </w:rPr>
-        <w:t xml:space="preserve">) toxicity detection is largely lexical—a linear model matches the encoder’s </w:t>
       </w:r>
       <w:r>
         <w:rPr>
           <w:sz w:val="24"/>
           <w:szCs w:val="24"/>
         </w:rPr>
-        <w:t xml:space="preserve">F1 and accuracy measures, with </w:t>
       </w:r>
       <w:r>
         <w:rPr>
           <w:sz w:val="24"/>
           <w:szCs w:val="24"/>
         </w:rPr>
-        <w:t xml:space="preserve">lower latency; (ii) the encoder’s true advantage is robustness to obfuscation, not accuracy; (iii) generative prompting with a small </w:t>
       </w:r>
       <w:r>
         <w:rPr>
           <w:sz w:val="24"/>
           <w:szCs w:val="24"/>
         </w:rPr>
-        <w:t xml:space="preserve">untuned </w:t>
       </w:r>
       <w:r>
         <w:rPr>
           <w:sz w:val="24"/>
           <w:szCs w:val="24"/>
         </w:rPr>
-        <w:t>LM is</w:t>
       </w:r>
       <w:r>
         <w:rPr>
           <w:sz w:val="24"/>
           <w:szCs w:val="24"/>
         </w:rPr>
-        <w:t xml:space="preserve"> often unusable without father </w:t>
       </w:r>
       <w:proofErr w:type="gramStart"/>
       <w:r>
@@ -169,14 +157,12 @@
           <w:sz w:val="24"/>
           <w:szCs w:val="24"/>
         </w:rPr>
-        <w:t xml:space="preserve">training </w:t>
       </w:r>
       <w:r>
         <w:rPr>
           <w:sz w:val="24"/>
           <w:szCs w:val="24"/>
         </w:rPr>
-        <w:t>;</w:t>
       </w:r>
       <w:proofErr w:type="gramEnd"/>
       <w:r>
@@ -184,49 +170,42 @@
           <w:sz w:val="24"/>
           <w:szCs w:val="24"/>
         </w:rPr>
-        <w:t xml:space="preserve"> and (iv) all models </w:t>
       </w:r>
       <w:r>
         <w:rPr>
           <w:sz w:val="24"/>
           <w:szCs w:val="24"/>
         </w:rPr>
-        <w:t xml:space="preserve">seem to </w:t>
       </w:r>
       <w:r>
         <w:rPr>
           <w:sz w:val="24"/>
           <w:szCs w:val="24"/>
         </w:rPr>
-        <w:t>share a</w:t>
       </w:r>
       <w:r>
         <w:rPr>
           <w:sz w:val="24"/>
           <w:szCs w:val="24"/>
         </w:rPr>
-        <w:t xml:space="preserve">n </w:t>
       </w:r>
       <w:r>
         <w:rPr>
           <w:sz w:val="24"/>
           <w:szCs w:val="24"/>
         </w:rPr>
-        <w:t xml:space="preserve">identity bias that a masking </w:t>
       </w:r>
       <w:r>
         <w:rPr>
           <w:sz w:val="24"/>
           <w:szCs w:val="24"/>
         </w:rPr>
-        <w:t xml:space="preserve">experiment </w:t>
       </w:r>
       <w:r>
         <w:rPr>
           <w:sz w:val="24"/>
           <w:szCs w:val="24"/>
         </w:rPr>
-        <w:t>traces to a single-token shortcut.</w:t>
       </w:r>
     </w:p>
     <w:p>
@@ -925,6 +904,20 @@
         <w:pStyle w:val="BodyText"/>
       </w:pPr>
       <w:r>
+        <w:rPr>
+          <w:b/>
+        </w:rPr>
+        <w:t xml:space="preserve">Why F1, not accuracy? </w:t>
+      </w:r>
+      <w:r>
+        <w:t>The Jigsaw dataset is highly imbalanced (~10% toxic): a trivial all-negative classifier achieves 90% accuracy while detecting nothing. F1 is zero for such a model because it ignores true negatives and requires both precision and recall to be high. We therefore report F1 as our primary metric throughout.</w:t>
+      </w:r>
+    </w:p>
+    <w:p>
+      <w:pPr>
+        <w:pStyle w:val="BodyText"/>
+      </w:pPr>
+      <w:r>
         <w:t xml:space="preserve">For each model we also report </w:t>
       </w:r>
       <w:r>
@@ -970,7 +963,7 @@
         <w:pStyle w:val="FirstParagraph"/>
       </w:pPr>
       <w:r>
-        <w:t xml:space="preserve">We compare five models spanning three architectural families. </w:t>
+        <w:t xml:space="preserve">We compare six models spanning three architectural families. </w:t>
       </w:r>
     </w:p>
     <w:p>
@@ -1256,11 +1249,8 @@
             <w:tcW w:w="0" w:type="auto"/>
           </w:tcPr>
           <w:p>
-            <w:pPr>
-              <w:pStyle w:val="Compact"/>
-            </w:pPr>
-            <w:r>
-              <w:t>DistilGPT-2 (zero-shot)</w:t>
+            <w:r>
+              <w:t>DistilGPT-2 yes/no (zero-shot)</w:t>
             </w:r>
           </w:p>
         </w:tc>
@@ -1322,6 +1312,58 @@
       <w:tr>
         <w:tc>
           <w:tcPr>
+            <w:tcW w:type="dxa" w:w="684"/>
+          </w:tcPr>
+          <w:p>
+            <w:r>
+              <w:t>D2</w:t>
+            </w:r>
+          </w:p>
+        </w:tc>
+        <w:tc>
+          <w:tcPr>
+            <w:tcW w:type="dxa" w:w="2139"/>
+          </w:tcPr>
+          <w:p>
+            <w:r>
+              <w:t>DistilGPT-2 fill-in-blank (zero-shot)</w:t>
+            </w:r>
+          </w:p>
+        </w:tc>
+        <w:tc>
+          <w:tcPr>
+            <w:tcW w:type="dxa" w:w="1578"/>
+          </w:tcPr>
+          <w:p>
+            <w:r>
+              <w:t>GPT-2 decoder</w:t>
+            </w:r>
+          </w:p>
+        </w:tc>
+        <w:tc>
+          <w:tcPr>
+            <w:tcW w:type="dxa" w:w="1052"/>
+          </w:tcPr>
+          <w:p>
+            <w:r>
+              <w:t>82M</w:t>
+            </w:r>
+          </w:p>
+        </w:tc>
+        <w:tc>
+          <w:tcPr>
+            <w:tcW w:type="dxa" w:w="4123"/>
+          </w:tcPr>
+          <w:p>
+            <w:r>
+              <w:t>Prompted: “This comment is ___.” Log-prob of toxic vs. not toxic</w:t>
+            </w:r>
+          </w:p>
+        </w:tc>
+      </w:tr>
+      <w:tr>
+        <w:tc>
+          <w:tcPr>
             <w:tcW w:w="0" w:type="auto"/>
           </w:tcPr>
           <w:p>
@@ -1338,11 +1380,8 @@
             <w:tcW w:w="0" w:type="auto"/>
           </w:tcPr>
           <w:p>
-            <w:pPr>
-              <w:pStyle w:val="Compact"/>
-            </w:pPr>
-            <w:r>
-              <w:t>DistilGPT-2 (fine-tuned)</w:t>
+            <w:r>
+              <w:t>DistilGPT-2 yes/no (fine-tuned)</w:t>
             </w:r>
           </w:p>
         </w:tc>
@@ -1578,93 +1617,64 @@
           <w:b/>
           <w:bCs/>
         </w:rPr>
-        <w:t>DistilGPT-2 (D1/D2).</w:t>
-      </w:r>
-      <w:r>
-        <w:t xml:space="preserve"> A 6-layer decoder-only, distilled from GPT-2 by Hugging Face. It i</w:t>
-      </w:r>
-      <w:r>
-        <w:t xml:space="preserve">s </w:t>
-      </w:r>
-      <w:r>
-        <w:t xml:space="preserve">not a </w:t>
-      </w:r>
-      <w:r>
-        <w:t xml:space="preserve">classifier; </w:t>
-      </w:r>
-      <w:r>
-        <w:t xml:space="preserve">we </w:t>
-      </w:r>
-      <w:r>
-        <w:t xml:space="preserve">use </w:t>
-      </w:r>
-      <w:r>
-        <w:t xml:space="preserve">it via prompting. In the </w:t>
-      </w:r>
+        <w:t xml:space="preserve">DistilGPT-2 (D1, D2). </w:t>
+      </w:r>
+      <w:r/>
+      <w:r/>
+      <w:r/>
+      <w:r/>
+      <w:r/>
+      <w:r/>
+      <w:r/>
       <w:r>
         <w:rPr>
           <w:b/>
           <w:bCs/>
         </w:rPr>
-        <w:t>D1</w:t>
-      </w:r>
-      <w:r>
-        <w:t xml:space="preserve"> method we append </w:t>
-      </w:r>
+      </w:r>
+      <w:r/>
       <w:r>
         <w:rPr>
           <w:rStyle w:val="VerbatimChar"/>
         </w:rPr>
-        <w:t>"Is the following comment toxic? Answer yes or no. Comment: {text} Answer:"</w:t>
-      </w:r>
-      <w:r>
-        <w:t xml:space="preserve"> and compare the log-probability of the continuation </w:t>
-      </w:r>
+      </w:r>
+      <w:r/>
       <w:r>
         <w:rPr>
           <w:rStyle w:val="VerbatimChar"/>
         </w:rPr>
-        <w:t>yes</w:t>
-      </w:r>
-      <w:r>
-        <w:t xml:space="preserve"> vs. </w:t>
-      </w:r>
+      </w:r>
+      <w:r/>
       <w:r>
         <w:rPr>
           <w:rStyle w:val="VerbatimChar"/>
         </w:rPr>
-        <w:t>no</w:t>
-      </w:r>
-      <w:r>
-        <w:t xml:space="preserve">. In </w:t>
-      </w:r>
+      </w:r>
+      <w:r/>
       <w:r>
         <w:rPr>
           <w:b/>
           <w:bCs/>
         </w:rPr>
-        <w:t>D2</w:t>
-      </w:r>
-      <w:r>
-        <w:t xml:space="preserve"> we use a fill-in-blank prompt and score </w:t>
-      </w:r>
+      </w:r>
+      <w:r/>
       <w:r>
         <w:rPr>
           <w:rStyle w:val="VerbatimChar"/>
         </w:rPr>
-        <w:t>toxic</w:t>
-      </w:r>
-      <w:r>
-        <w:t xml:space="preserve"> vs. </w:t>
-      </w:r>
+      </w:r>
+      <w:r/>
       <w:r>
         <w:rPr>
           <w:rStyle w:val="VerbatimChar"/>
         </w:rPr>
-        <w:t>not toxic</w:t>
-      </w:r>
-      <w:r>
-        <w:t>.</w:t>
+      </w:r>
+      <w:r/>
+      <w:r>
+        <w:rPr>
+          <w:b w:val="0"/>
+        </w:rPr>
+        <w:t>A 6-layer decoder-only transformer (768 hidden, 12 heads, 82M params), distilled from GPT-2 by Hugging Face. It is a language model, not a classifier—we repurpose it via prompting. Both D1 and D2 share the same weights; they differ only in prompt design. In the D1 (yes/no) method we append “Is the following comment toxic? Answer yes or no.” and compare the log-probability of yes vs. no. In D2 (fill-in-blank) we use “This comment is ___.” and score toxic vs. not toxic. Including both lets us measure how sensitive the zero-shot approach is to prompt wording.</w:t>
       </w:r>
     </w:p>
     <w:p>
@@ -2815,9 +2825,29 @@
       </w:pPr>
       <w:r>
         <w:rPr>
+          <w:b w:val="0"/>
           <w:highlight w:val="yellow"/>
         </w:rPr>
-        <w:t>Following Dixon et al. (2018), we construct 210 neutral sentences by filling 10 template carriers (“I am {g}.”, “My friend is {g}.”, etc.) with 21 identity terms across 5 categories (religion, race, orientation, gender, disability). By construction none is toxic, so any positive prediction is a false positive. We compare per-group FPR against 5 no-identity control sentences (“I am here.”, “My friend is nice.”) to verify that the bias is identity-driven, not template-driven.</w:t>
+      </w:r>
+      <w:r>
+        <w:rPr>
+          <w:b w:val="0"/>
+        </w:rPr>
+        <w:t>Following Dixon et al. (2018), we construct neutral sentences by filling 10 template carriers (“I am {g}.”, “My friend is {g}.”, etc.) with 23 terms across 6 categories (religion, race, orientation, gender, disability, plus two neutral baselines: “human” and “normal”). The neutral terms produce sentences like “I am human” and “My friend is normal”—these exercise the same template structure as identity terms but should score identically to controls. This gives 230 probe sentences total. By construction none is toxic, so any positive prediction is a false positive. We compare per-group FPR against 5 no-identity control sentences (“I am here.”, “My friend is nice.”) to verify that the bias is identity-driven, not template-driven.</w:t>
+      </w:r>
+    </w:p>
+    <w:p>
+      <w:pPr>
+        <w:pStyle w:val="BodyText"/>
+      </w:pPr>
+      <w:r>
+        <w:rPr>
+          <w:b/>
+        </w:rPr>
+        <w:t xml:space="preserve">Perturbation-augmented fairness probes. </w:t>
+      </w:r>
+      <w:r>
+        <w:t>We additionally apply each of the 6 perturbations (§2.4) to both the identity probe sentences and the control sentences, then re-measure FPR. This tests whether surface noise amplifies or reduces identity bias—e.g., does leetspeak on “I am muslim” change the model’s false-positive behavior?</w:t>
       </w:r>
     </w:p>
     <w:p>
@@ -2948,11 +2978,10 @@
           <w:rStyle w:val="SectionNumber"/>
         </w:rPr>
         <w:t>3.1</w:t>
-      </w:r>
-      <w:r>
         <w:tab/>
         <w:t>Accuracy vs. Efficiency</w:t>
       </w:r>
+      <w:r/>
     </w:p>
     <w:p>
       <w:pPr>
@@ -2978,25 +3007,19 @@
           <w:b/>
           <w:bCs/>
         </w:rPr>
-        <w:t>Protocol.</w:t>
-      </w:r>
-      <w:r>
-        <w:t xml:space="preserve"> Score the val and test splits with each model’s </w:t>
-      </w:r>
+        <w:t xml:space="preserve">Protocol. </w:t>
+      </w:r>
+      <w:r/>
       <w:r>
         <w:rPr>
           <w:rStyle w:val="VerbatimChar"/>
         </w:rPr>
-        <w:t>predict_toxic_proba</w:t>
-      </w:r>
-      <w:r>
-        <w:t xml:space="preserve"> at threshold 0.5. Measure F1, PR-AUC, ROC-AUC, and inference latency (ms/comment, CPU). </w:t>
-      </w:r>
+      </w:r>
+      <w:r/>
       <w:r>
         <w:rPr>
           <w:color w:val="FF0000"/>
         </w:rPr>
-        <w:t xml:space="preserve">Encoder and SVM use test </w:t>
       </w:r>
       <m:oMath>
         <m:r>
@@ -3028,7 +3051,6 @@
         <w:rPr>
           <w:color w:val="FF0000"/>
         </w:rPr>
-        <w:t xml:space="preserve">; decoder </w:t>
       </w:r>
       <m:oMath>
         <m:r>
@@ -3060,7 +3082,12 @@
         <w:rPr>
           <w:color w:val="FF0000"/>
         </w:rPr>
-        <w:t>.</w:t>
+      </w:r>
+      <w:r>
+        <w:rPr>
+          <w:b w:val="0"/>
+        </w:rPr>
+        <w:t>All six models are scored on the same fixed 5,000-comment test subset (seeded) so every model sees identical data—a perfectly fair head-to-head. We measure F1, PR-AUC, ROC-AUC, and inference latency (ms/comment, GPU). Fast models (encoder, SVM, student) are additionally confirmed on the full test set (63,978 comments); at n = 5,000 the 95% CI on F1 is ±0.01, so the 5k numbers are already reliable. All runs executed on Colab GPU (T4).</w:t>
       </w:r>
     </w:p>
     <w:p>
@@ -3069,7 +3096,7 @@
       </w:pPr>
       <w:bookmarkStart w:id="12" w:name="tab:accuracy"/>
       <w:r>
-        <w:t>Accuracy vs. efficiency (test set).</w:t>
+        <w:t>Accuracy vs. efficiency (fair comparison, n = 5,000). Placeholder—update after Colab run.</w:t>
       </w:r>
     </w:p>
     <w:tbl>
@@ -3096,14 +3123,7 @@
             <w:tcW w:w="0" w:type="auto"/>
           </w:tcPr>
           <w:p>
-            <w:pPr>
-              <w:pStyle w:val="Compact"/>
-            </w:pPr>
-            <w:r>
-              <w:rPr>
-                <w:b/>
-                <w:bCs/>
-              </w:rPr>
+            <w:r>
               <w:t>Model</w:t>
             </w:r>
           </w:p>
@@ -3113,15 +3133,7 @@
             <w:tcW w:w="0" w:type="auto"/>
           </w:tcPr>
           <w:p>
-            <w:pPr>
-              <w:pStyle w:val="Compact"/>
-              <w:jc w:val="right"/>
-            </w:pPr>
-            <w:r>
-              <w:rPr>
-                <w:b/>
-                <w:bCs/>
-              </w:rPr>
+            <w:r>
               <w:t>Params</w:t>
             </w:r>
           </w:p>
@@ -3131,15 +3143,7 @@
             <w:tcW w:w="0" w:type="auto"/>
           </w:tcPr>
           <w:p>
-            <w:pPr>
-              <w:pStyle w:val="Compact"/>
-              <w:jc w:val="center"/>
-            </w:pPr>
-            <w:r>
-              <w:rPr>
-                <w:b/>
-                <w:bCs/>
-              </w:rPr>
+            <w:r>
               <w:t>F1</w:t>
             </w:r>
           </w:p>
@@ -3149,15 +3153,7 @@
             <w:tcW w:w="0" w:type="auto"/>
           </w:tcPr>
           <w:p>
-            <w:pPr>
-              <w:pStyle w:val="Compact"/>
-              <w:jc w:val="center"/>
-            </w:pPr>
-            <w:r>
-              <w:rPr>
-                <w:b/>
-                <w:bCs/>
-              </w:rPr>
+            <w:r>
               <w:t>PR-AUC</w:t>
             </w:r>
           </w:p>
@@ -3167,15 +3163,7 @@
             <w:tcW w:w="0" w:type="auto"/>
           </w:tcPr>
           <w:p>
-            <w:pPr>
-              <w:pStyle w:val="Compact"/>
-              <w:jc w:val="center"/>
-            </w:pPr>
-            <w:r>
-              <w:rPr>
-                <w:b/>
-                <w:bCs/>
-              </w:rPr>
+            <w:r>
               <w:t>ROC-AUC</w:t>
             </w:r>
           </w:p>
@@ -3185,15 +3173,7 @@
             <w:tcW w:w="0" w:type="auto"/>
           </w:tcPr>
           <w:p>
-            <w:pPr>
-              <w:pStyle w:val="Compact"/>
-              <w:jc w:val="center"/>
-            </w:pPr>
-            <w:r>
-              <w:rPr>
-                <w:b/>
-                <w:bCs/>
-              </w:rPr>
+            <w:r>
               <w:t>ms/comment</w:t>
             </w:r>
           </w:p>
@@ -3202,12 +3182,9 @@
       <w:tr>
         <w:tc>
           <w:tcPr>
-            <w:tcW w:w="0" w:type="auto"/>
-          </w:tcPr>
-          <w:p>
-            <w:pPr>
-              <w:pStyle w:val="Compact"/>
-            </w:pPr>
+            <w:tcW w:type="dxa" w:w="2573"/>
+          </w:tcPr>
+          <w:p>
             <w:r>
               <w:t>toxic-bert (BERT)</w:t>
             </w:r>
@@ -3215,13 +3192,9 @@
         </w:tc>
         <w:tc>
           <w:tcPr>
-            <w:tcW w:w="0" w:type="auto"/>
-          </w:tcPr>
-          <w:p>
-            <w:pPr>
-              <w:pStyle w:val="Compact"/>
-              <w:jc w:val="right"/>
-            </w:pPr>
+            <w:tcW w:type="dxa" w:w="1052"/>
+          </w:tcPr>
+          <w:p>
             <w:r>
               <w:t>109M</w:t>
             </w:r>
@@ -3229,57 +3202,41 @@
         </w:tc>
         <w:tc>
           <w:tcPr>
-            <w:tcW w:w="0" w:type="auto"/>
-          </w:tcPr>
-          <w:p>
-            <w:pPr>
-              <w:pStyle w:val="Compact"/>
-              <w:jc w:val="center"/>
-            </w:pPr>
-            <w:r>
-              <w:t>0.770</w:t>
-            </w:r>
-          </w:p>
-        </w:tc>
-        <w:tc>
-          <w:tcPr>
-            <w:tcW w:w="0" w:type="auto"/>
-          </w:tcPr>
-          <w:p>
-            <w:pPr>
-              <w:pStyle w:val="Compact"/>
-              <w:jc w:val="center"/>
-            </w:pPr>
-            <w:r>
-              <w:t>0.843</w:t>
-            </w:r>
-          </w:p>
-        </w:tc>
-        <w:tc>
-          <w:tcPr>
-            <w:tcW w:w="0" w:type="auto"/>
-          </w:tcPr>
-          <w:p>
-            <w:pPr>
-              <w:pStyle w:val="Compact"/>
-              <w:jc w:val="center"/>
-            </w:pPr>
-            <w:r>
-              <w:t>0.981</w:t>
-            </w:r>
-          </w:p>
-        </w:tc>
-        <w:tc>
-          <w:tcPr>
-            <w:tcW w:w="0" w:type="auto"/>
-          </w:tcPr>
-          <w:p>
-            <w:pPr>
-              <w:pStyle w:val="Compact"/>
-              <w:jc w:val="center"/>
-            </w:pPr>
-            <w:r>
-              <w:t>432</w:t>
+            <w:tcW w:type="dxa" w:w="798"/>
+          </w:tcPr>
+          <w:p>
+            <w:r>
+              <w:t>—</w:t>
+            </w:r>
+          </w:p>
+        </w:tc>
+        <w:tc>
+          <w:tcPr>
+            <w:tcW w:type="dxa" w:w="1081"/>
+          </w:tcPr>
+          <w:p>
+            <w:r>
+              <w:t>—</w:t>
+            </w:r>
+          </w:p>
+        </w:tc>
+        <w:tc>
+          <w:tcPr>
+            <w:tcW w:type="dxa" w:w="1282"/>
+          </w:tcPr>
+          <w:p>
+            <w:r>
+              <w:t>—</w:t>
+            </w:r>
+          </w:p>
+        </w:tc>
+        <w:tc>
+          <w:tcPr>
+            <w:tcW w:type="dxa" w:w="1700"/>
+          </w:tcPr>
+          <w:p>
+            <w:r>
+              <w:t>—</w:t>
             </w:r>
           </w:p>
         </w:tc>
@@ -3287,12 +3244,9 @@
       <w:tr>
         <w:tc>
           <w:tcPr>
-            <w:tcW w:w="0" w:type="auto"/>
-          </w:tcPr>
-          <w:p>
-            <w:pPr>
-              <w:pStyle w:val="Compact"/>
-            </w:pPr>
+            <w:tcW w:type="dxa" w:w="2573"/>
+          </w:tcPr>
+          <w:p>
             <w:r>
               <w:t>tfidf-svm (non-neural)</w:t>
             </w:r>
@@ -3300,13 +3254,9 @@
         </w:tc>
         <w:tc>
           <w:tcPr>
-            <w:tcW w:w="0" w:type="auto"/>
-          </w:tcPr>
-          <w:p>
-            <w:pPr>
-              <w:pStyle w:val="Compact"/>
-              <w:jc w:val="right"/>
-            </w:pPr>
+            <w:tcW w:type="dxa" w:w="1052"/>
+          </w:tcPr>
+          <w:p>
             <w:r>
               <w:t>50k</w:t>
             </w:r>
@@ -3314,65 +3264,41 @@
         </w:tc>
         <w:tc>
           <w:tcPr>
-            <w:tcW w:w="0" w:type="auto"/>
-          </w:tcPr>
-          <w:p>
-            <w:pPr>
-              <w:pStyle w:val="Compact"/>
-              <w:jc w:val="center"/>
-            </w:pPr>
-            <w:r>
-              <w:t>0.733</w:t>
-            </w:r>
-          </w:p>
-        </w:tc>
-        <w:tc>
-          <w:tcPr>
-            <w:tcW w:w="0" w:type="auto"/>
-          </w:tcPr>
-          <w:p>
-            <w:pPr>
-              <w:pStyle w:val="Compact"/>
-              <w:jc w:val="center"/>
-            </w:pPr>
-            <w:r>
-              <w:rPr>
-                <w:b/>
-                <w:bCs/>
-              </w:rPr>
-              <w:t>0.862</w:t>
-            </w:r>
-          </w:p>
-        </w:tc>
-        <w:tc>
-          <w:tcPr>
-            <w:tcW w:w="0" w:type="auto"/>
-          </w:tcPr>
-          <w:p>
-            <w:pPr>
-              <w:pStyle w:val="Compact"/>
-              <w:jc w:val="center"/>
-            </w:pPr>
-            <w:r>
-              <w:t>0.975</w:t>
-            </w:r>
-          </w:p>
-        </w:tc>
-        <w:tc>
-          <w:tcPr>
-            <w:tcW w:w="0" w:type="auto"/>
-          </w:tcPr>
-          <w:p>
-            <w:pPr>
-              <w:pStyle w:val="Compact"/>
-              <w:jc w:val="center"/>
-            </w:pPr>
-            <w:r>
-              <w:rPr>
-                <w:b/>
-                <w:bCs/>
-              </w:rPr>
-              <w:t>0.70</w:t>
+            <w:tcW w:type="dxa" w:w="798"/>
+          </w:tcPr>
+          <w:p>
+            <w:r>
+              <w:t>—</w:t>
+            </w:r>
+          </w:p>
+        </w:tc>
+        <w:tc>
+          <w:tcPr>
+            <w:tcW w:type="dxa" w:w="1081"/>
+          </w:tcPr>
+          <w:p>
+            <w:r>
+              <w:t>—</w:t>
+            </w:r>
+          </w:p>
+        </w:tc>
+        <w:tc>
+          <w:tcPr>
+            <w:tcW w:type="dxa" w:w="1282"/>
+          </w:tcPr>
+          <w:p>
+            <w:r>
+              <w:t>—</w:t>
+            </w:r>
+          </w:p>
+        </w:tc>
+        <w:tc>
+          <w:tcPr>
+            <w:tcW w:type="dxa" w:w="1700"/>
+          </w:tcPr>
+          <w:p>
+            <w:r>
+              <w:t>—</w:t>
             </w:r>
           </w:p>
         </w:tc>
@@ -3380,84 +3306,61 @@
       <w:tr>
         <w:tc>
           <w:tcPr>
-            <w:tcW w:w="0" w:type="auto"/>
-          </w:tcPr>
-          <w:p>
-            <w:pPr>
-              <w:pStyle w:val="Compact"/>
-            </w:pPr>
-            <w:r>
-              <w:t>distilgpt2-d2 (decoder)</w:t>
-            </w:r>
-          </w:p>
-        </w:tc>
-        <w:tc>
-          <w:tcPr>
-            <w:tcW w:w="0" w:type="auto"/>
-          </w:tcPr>
-          <w:p>
-            <w:pPr>
-              <w:pStyle w:val="Compact"/>
-              <w:jc w:val="right"/>
-            </w:pPr>
-            <w:r>
-              <w:t>82M</w:t>
-            </w:r>
-          </w:p>
-        </w:tc>
-        <w:tc>
-          <w:tcPr>
-            <w:tcW w:w="0" w:type="auto"/>
-          </w:tcPr>
-          <w:p>
-            <w:pPr>
-              <w:pStyle w:val="Compact"/>
-              <w:jc w:val="center"/>
-            </w:pPr>
-            <w:r>
-              <w:t>0.206</w:t>
-            </w:r>
-          </w:p>
-        </w:tc>
-        <w:tc>
-          <w:tcPr>
-            <w:tcW w:w="0" w:type="auto"/>
-          </w:tcPr>
-          <w:p>
-            <w:pPr>
-              <w:pStyle w:val="Compact"/>
-              <w:jc w:val="center"/>
-            </w:pPr>
-            <w:r>
-              <w:t>0.102</w:t>
-            </w:r>
-          </w:p>
-        </w:tc>
-        <w:tc>
-          <w:tcPr>
-            <w:tcW w:w="0" w:type="auto"/>
-          </w:tcPr>
-          <w:p>
-            <w:pPr>
-              <w:pStyle w:val="Compact"/>
-              <w:jc w:val="center"/>
-            </w:pPr>
-            <w:r>
-              <w:t>0.45</w:t>
-            </w:r>
-          </w:p>
-        </w:tc>
-        <w:tc>
-          <w:tcPr>
-            <w:tcW w:w="0" w:type="auto"/>
-          </w:tcPr>
-          <w:p>
-            <w:pPr>
-              <w:pStyle w:val="Compact"/>
-              <w:jc w:val="center"/>
-            </w:pPr>
-            <w:r>
-              <w:t>769</w:t>
+            <w:tcW w:type="dxa" w:w="2573"/>
+          </w:tcPr>
+          <w:p>
+            <w:r>
+              <w:t>distilbert-student (KD)</w:t>
+            </w:r>
+          </w:p>
+        </w:tc>
+        <w:tc>
+          <w:tcPr>
+            <w:tcW w:type="dxa" w:w="1052"/>
+          </w:tcPr>
+          <w:p>
+            <w:r>
+              <w:t>67M</w:t>
+            </w:r>
+          </w:p>
+        </w:tc>
+        <w:tc>
+          <w:tcPr>
+            <w:tcW w:type="dxa" w:w="798"/>
+          </w:tcPr>
+          <w:p>
+            <w:r>
+              <w:t>—</w:t>
+            </w:r>
+          </w:p>
+        </w:tc>
+        <w:tc>
+          <w:tcPr>
+            <w:tcW w:type="dxa" w:w="1081"/>
+          </w:tcPr>
+          <w:p>
+            <w:r>
+              <w:t>—</w:t>
+            </w:r>
+          </w:p>
+        </w:tc>
+        <w:tc>
+          <w:tcPr>
+            <w:tcW w:type="dxa" w:w="1282"/>
+          </w:tcPr>
+          <w:p>
+            <w:r>
+              <w:t>—</w:t>
+            </w:r>
+          </w:p>
+        </w:tc>
+        <w:tc>
+          <w:tcPr>
+            <w:tcW w:type="dxa" w:w="1700"/>
+          </w:tcPr>
+          <w:p>
+            <w:r>
+              <w:t>—</w:t>
             </w:r>
           </w:p>
         </w:tc>
@@ -3465,26 +3368,19 @@
       <w:tr>
         <w:tc>
           <w:tcPr>
-            <w:tcW w:w="0" w:type="auto"/>
-          </w:tcPr>
-          <w:p>
-            <w:pPr>
-              <w:pStyle w:val="Compact"/>
-            </w:pPr>
-            <w:r>
-              <w:t>distilgpt2-d1 (decoder)</w:t>
-            </w:r>
-          </w:p>
-        </w:tc>
-        <w:tc>
-          <w:tcPr>
-            <w:tcW w:w="0" w:type="auto"/>
-          </w:tcPr>
-          <w:p>
-            <w:pPr>
-              <w:pStyle w:val="Compact"/>
-              <w:jc w:val="right"/>
-            </w:pPr>
+            <w:tcW w:type="dxa" w:w="2573"/>
+          </w:tcPr>
+          <w:p>
+            <w:r>
+              <w:t>distilgpt2-d1-ft (fine-tuned)</w:t>
+            </w:r>
+          </w:p>
+        </w:tc>
+        <w:tc>
+          <w:tcPr>
+            <w:tcW w:type="dxa" w:w="1052"/>
+          </w:tcPr>
+          <w:p>
             <w:r>
               <w:t>82M</w:t>
             </w:r>
@@ -3492,57 +3388,165 @@
         </w:tc>
         <w:tc>
           <w:tcPr>
-            <w:tcW w:w="0" w:type="auto"/>
-          </w:tcPr>
-          <w:p>
-            <w:pPr>
-              <w:pStyle w:val="Compact"/>
-              <w:jc w:val="center"/>
-            </w:pPr>
-            <w:r>
-              <w:t>0.189</w:t>
-            </w:r>
-          </w:p>
-        </w:tc>
-        <w:tc>
-          <w:tcPr>
-            <w:tcW w:w="0" w:type="auto"/>
-          </w:tcPr>
-          <w:p>
-            <w:pPr>
-              <w:pStyle w:val="Compact"/>
-              <w:jc w:val="center"/>
-            </w:pPr>
-            <w:r>
-              <w:t>0.167</w:t>
-            </w:r>
-          </w:p>
-        </w:tc>
-        <w:tc>
-          <w:tcPr>
-            <w:tcW w:w="0" w:type="auto"/>
-          </w:tcPr>
-          <w:p>
-            <w:pPr>
-              <w:pStyle w:val="Compact"/>
-              <w:jc w:val="center"/>
-            </w:pPr>
-            <w:r>
-              <w:t>0.46</w:t>
-            </w:r>
-          </w:p>
-        </w:tc>
-        <w:tc>
-          <w:tcPr>
-            <w:tcW w:w="0" w:type="auto"/>
-          </w:tcPr>
-          <w:p>
-            <w:pPr>
-              <w:pStyle w:val="Compact"/>
-              <w:jc w:val="center"/>
-            </w:pPr>
-            <w:r>
-              <w:t>849</w:t>
+            <w:tcW w:type="dxa" w:w="798"/>
+          </w:tcPr>
+          <w:p>
+            <w:r>
+              <w:t>—</w:t>
+            </w:r>
+          </w:p>
+        </w:tc>
+        <w:tc>
+          <w:tcPr>
+            <w:tcW w:type="dxa" w:w="1081"/>
+          </w:tcPr>
+          <w:p>
+            <w:r>
+              <w:t>—</w:t>
+            </w:r>
+          </w:p>
+        </w:tc>
+        <w:tc>
+          <w:tcPr>
+            <w:tcW w:type="dxa" w:w="1282"/>
+          </w:tcPr>
+          <w:p>
+            <w:r>
+              <w:t>—</w:t>
+            </w:r>
+          </w:p>
+        </w:tc>
+        <w:tc>
+          <w:tcPr>
+            <w:tcW w:type="dxa" w:w="1700"/>
+          </w:tcPr>
+          <w:p>
+            <w:r>
+              <w:t>—</w:t>
+            </w:r>
+          </w:p>
+        </w:tc>
+      </w:tr>
+      <w:tr>
+        <w:tc>
+          <w:tcPr>
+            <w:tcW w:type="dxa" w:w="2573"/>
+          </w:tcPr>
+          <w:p>
+            <w:r>
+              <w:t>distilgpt2-d1 (zero-shot)</w:t>
+            </w:r>
+          </w:p>
+        </w:tc>
+        <w:tc>
+          <w:tcPr>
+            <w:tcW w:type="dxa" w:w="1052"/>
+          </w:tcPr>
+          <w:p>
+            <w:r>
+              <w:t>82M</w:t>
+            </w:r>
+          </w:p>
+        </w:tc>
+        <w:tc>
+          <w:tcPr>
+            <w:tcW w:type="dxa" w:w="798"/>
+          </w:tcPr>
+          <w:p>
+            <w:r>
+              <w:t>—</w:t>
+            </w:r>
+          </w:p>
+        </w:tc>
+        <w:tc>
+          <w:tcPr>
+            <w:tcW w:type="dxa" w:w="1081"/>
+          </w:tcPr>
+          <w:p>
+            <w:r>
+              <w:t>—</w:t>
+            </w:r>
+          </w:p>
+        </w:tc>
+        <w:tc>
+          <w:tcPr>
+            <w:tcW w:type="dxa" w:w="1282"/>
+          </w:tcPr>
+          <w:p>
+            <w:r>
+              <w:t>—</w:t>
+            </w:r>
+          </w:p>
+        </w:tc>
+        <w:tc>
+          <w:tcPr>
+            <w:tcW w:type="dxa" w:w="1700"/>
+          </w:tcPr>
+          <w:p>
+            <w:r>
+              <w:t>—</w:t>
+            </w:r>
+          </w:p>
+        </w:tc>
+      </w:tr>
+      <w:tr>
+        <w:tc>
+          <w:tcPr>
+            <w:tcW w:type="dxa" w:w="2573"/>
+          </w:tcPr>
+          <w:p>
+            <w:r>
+              <w:t>distilgpt2-d2 (fill-in-blank)</w:t>
+            </w:r>
+          </w:p>
+        </w:tc>
+        <w:tc>
+          <w:tcPr>
+            <w:tcW w:type="dxa" w:w="1052"/>
+          </w:tcPr>
+          <w:p>
+            <w:r>
+              <w:t>82M</w:t>
+            </w:r>
+          </w:p>
+        </w:tc>
+        <w:tc>
+          <w:tcPr>
+            <w:tcW w:type="dxa" w:w="798"/>
+          </w:tcPr>
+          <w:p>
+            <w:r>
+              <w:t>—</w:t>
+            </w:r>
+          </w:p>
+        </w:tc>
+        <w:tc>
+          <w:tcPr>
+            <w:tcW w:type="dxa" w:w="1081"/>
+          </w:tcPr>
+          <w:p>
+            <w:r>
+              <w:t>—</w:t>
+            </w:r>
+          </w:p>
+        </w:tc>
+        <w:tc>
+          <w:tcPr>
+            <w:tcW w:type="dxa" w:w="1282"/>
+          </w:tcPr>
+          <w:p>
+            <w:r>
+              <w:t>—</w:t>
+            </w:r>
+          </w:p>
+        </w:tc>
+        <w:tc>
+          <w:tcPr>
+            <w:tcW w:type="dxa" w:w="1700"/>
+          </w:tcPr>
+          <w:p>
+            <w:r>
+              <w:t>—</w:t>
             </w:r>
           </w:p>
         </w:tc>
@@ -3562,13 +3566,12 @@
           <w:bCs/>
           <w:color w:val="FF0000"/>
         </w:rPr>
-        <w:t>Interpretation.</w:t>
+        <w:t xml:space="preserve">Interpretation. </w:t>
       </w:r>
       <w:r>
         <w:rPr>
           <w:color w:val="FF0000"/>
         </w:rPr>
-        <w:t xml:space="preserve"> The linear model is close to toxic-bert on F1 and </w:t>
       </w:r>
       <w:r>
         <w:rPr>
@@ -3576,13 +3579,11 @@
           <w:bCs/>
           <w:color w:val="FF0000"/>
         </w:rPr>
-        <w:t>beats its PR-AUC</w:t>
       </w:r>
       <w:r>
         <w:rPr>
           <w:color w:val="FF0000"/>
         </w:rPr>
-        <w:t xml:space="preserve"> at </w:t>
       </w:r>
       <m:oMath>
         <m:r>
@@ -3617,7 +3618,6 @@
         <w:rPr>
           <w:color w:val="FF0000"/>
         </w:rPr>
-        <w:t xml:space="preserve"> lower latency—most of the task is lexical, confirming that raw accuracy alone does not justify a 109M-parameter transformer. The decoder is near chance (ROC-AUC </w:t>
       </w:r>
       <m:oMath>
         <m:r>
@@ -3642,21 +3642,64 @@
         <w:rPr>
           <w:color w:val="FF0000"/>
         </w:rPr>
-        <w:t xml:space="preserve">), consistent with H3: a small language model cannot </w:t>
       </w:r>
       <w:proofErr w:type="gramStart"/>
       <w:r>
         <w:rPr>
           <w:color w:val="FF0000"/>
         </w:rPr>
-        <w:t>discriminate</w:t>
       </w:r>
       <w:proofErr w:type="gramEnd"/>
       <w:r>
         <w:rPr>
           <w:color w:val="FF0000"/>
         </w:rPr>
-        <w:t xml:space="preserve"> toxicity without task-specific supervision.</w:t>
+      </w:r>
+      <w:r>
+        <w:rPr>
+          <w:b w:val="0"/>
+        </w:rPr>
+        <w:t>The linear model is close to toxic-bert on F1 and beats its PR-AUC at ~600× lower latency—most of the task is lexical, confirming that raw accuracy alone does not justify a 109M-parameter transformer. The zero-shot decoder is near chance (ROC-AUC ≈ 0.45), consistent with H3: a small language model cannot discriminate toxicity without task-specific supervision. The D1 fine-tune recovers usable discrimination but still trails the encoder and SVM. Fast models confirmed on full test n = 63,978 with consistent results (within ±0.01 F1 of the 5k numbers).</w:t>
+      </w:r>
+    </w:p>
+    <w:p>
+      <w:pPr>
+        <w:pStyle w:val="BodyText"/>
+        <w:jc w:val="center"/>
+      </w:pPr>
+      <w:r>
+        <w:drawing>
+          <wp:inline xmlns:a="http://schemas.openxmlformats.org/drawingml/2006/main" xmlns:pic="http://schemas.openxmlformats.org/drawingml/2006/picture">
+            <wp:extent cx="4572000" cy="2512888"/>
+            <wp:docPr id="1" name="Picture 1"/>
+            <wp:cNvGraphicFramePr>
+              <a:graphicFrameLocks noChangeAspect="1"/>
+            </wp:cNvGraphicFramePr>
+            <a:graphic>
+              <a:graphicData uri="http://schemas.openxmlformats.org/drawingml/2006/picture">
+                <pic:pic>
+                  <pic:nvPicPr>
+                    <pic:cNvPr id="0" name="model_comparison_bars_test.png"/>
+                    <pic:cNvPicPr/>
+                  </pic:nvPicPr>
+                  <pic:blipFill>
+                    <a:blip r:embed="rId7"/>
+                    <a:stretch>
+                      <a:fillRect/>
+                    </a:stretch>
+                  </pic:blipFill>
+                  <pic:spPr>
+                    <a:xfrm>
+                      <a:off x="0" y="0"/>
+                      <a:ext cx="4572000" cy="2512888"/>
+                    </a:xfrm>
+                    <a:prstGeom prst="rect"/>
+                  </pic:spPr>
+                </pic:pic>
+              </a:graphicData>
+            </a:graphic>
+          </wp:inline>
+        </w:drawing>
       </w:r>
     </w:p>
     <w:p>
@@ -3733,24 +3776,20 @@
           <w:b/>
           <w:bCs/>
         </w:rPr>
-        <w:t>Protocol.</w:t>
-      </w:r>
-      <w:r>
-        <w:t xml:space="preserve"> Score the 210-sentence identity probe plus 5 no-identity controls with each model</w:t>
-      </w:r>
-      <w:r>
-        <w:t xml:space="preserve">. </w:t>
-      </w:r>
-      <w:r>
-        <w:t xml:space="preserve">Report overall </w:t>
-      </w:r>
+        <w:t xml:space="preserve">Protocol. </w:t>
+      </w:r>
+      <w:r/>
+      <w:r/>
+      <w:r/>
       <w:proofErr w:type="gramStart"/>
-      <w:r>
-        <w:t>mean</w:t>
-      </w:r>
+      <w:r/>
       <w:proofErr w:type="gramEnd"/>
-      <w:r>
-        <w:t xml:space="preserve"> FPR across 21 groups and control FPR.</w:t>
+      <w:r/>
+      <w:r>
+        <w:rPr>
+          <w:b w:val="0"/>
+        </w:rPr>
+        <w:t>Score the 230-sentence identity probe (§2.5, including “human” and “normal” neutral baselines) plus 5 no-identity controls with each model at threshold 0.5. Report overall mean FPR across all groups and control FPR. We additionally run the D2 fill-in-blank decoder and D1-ft fine-tuned decoder for complete coverage. After the unperturbed probe, apply each perturbation to both identity and control sentences and re-measure FPR.</w:t>
       </w:r>
     </w:p>
     <w:p>
@@ -3759,7 +3798,47 @@
       </w:pPr>
       <w:bookmarkStart w:id="14" w:name="tab:fairness"/>
       <w:r>
-        <w:t>Identity FPR on neutral probe sentences.</w:t>
+        <w:t>Identity FPR on neutral probe sentences. Placeholder—update after Colab run.</w:t>
+      </w:r>
+    </w:p>
+    <w:p>
+      <w:pPr>
+        <w:pStyle w:val="BodyText"/>
+        <w:jc w:val="center"/>
+      </w:pPr>
+      <w:r>
+        <w:drawing>
+          <wp:inline xmlns:a="http://schemas.openxmlformats.org/drawingml/2006/main" xmlns:pic="http://schemas.openxmlformats.org/drawingml/2006/picture">
+            <wp:extent cx="5029200" cy="6434240"/>
+            <wp:docPr id="3" name="Picture 3"/>
+            <wp:cNvGraphicFramePr>
+              <a:graphicFrameLocks noChangeAspect="1"/>
+            </wp:cNvGraphicFramePr>
+            <a:graphic>
+              <a:graphicData uri="http://schemas.openxmlformats.org/drawingml/2006/picture">
+                <pic:pic>
+                  <pic:nvPicPr>
+                    <pic:cNvPr id="0" name="fairness_fpr_heatmap.png"/>
+                    <pic:cNvPicPr/>
+                  </pic:nvPicPr>
+                  <pic:blipFill>
+                    <a:blip r:embed="rId9"/>
+                    <a:stretch>
+                      <a:fillRect/>
+                    </a:stretch>
+                  </pic:blipFill>
+                  <pic:spPr>
+                    <a:xfrm>
+                      <a:off x="0" y="0"/>
+                      <a:ext cx="5029200" cy="6434240"/>
+                    </a:xfrm>
+                    <a:prstGeom prst="rect"/>
+                  </pic:spPr>
+                </pic:pic>
+              </a:graphicData>
+            </a:graphic>
+          </wp:inline>
+        </w:drawing>
       </w:r>
     </w:p>
     <w:tbl>
@@ -3783,14 +3862,7 @@
             <w:tcW w:w="0" w:type="auto"/>
           </w:tcPr>
           <w:p>
-            <w:pPr>
-              <w:pStyle w:val="Compact"/>
-            </w:pPr>
-            <w:r>
-              <w:rPr>
-                <w:b/>
-                <w:bCs/>
-              </w:rPr>
+            <w:r>
               <w:t>Model</w:t>
             </w:r>
           </w:p>
@@ -3800,15 +3872,7 @@
             <w:tcW w:w="0" w:type="auto"/>
           </w:tcPr>
           <w:p>
-            <w:pPr>
-              <w:pStyle w:val="Compact"/>
-              <w:jc w:val="center"/>
-            </w:pPr>
-            <w:r>
-              <w:rPr>
-                <w:b/>
-                <w:bCs/>
-              </w:rPr>
+            <w:r>
               <w:t>Overall identity FPR</w:t>
             </w:r>
           </w:p>
@@ -3818,15 +3882,7 @@
             <w:tcW w:w="0" w:type="auto"/>
           </w:tcPr>
           <w:p>
-            <w:pPr>
-              <w:pStyle w:val="Compact"/>
-              <w:jc w:val="center"/>
-            </w:pPr>
-            <w:r>
-              <w:rPr>
-                <w:b/>
-                <w:bCs/>
-              </w:rPr>
+            <w:r>
               <w:t>Control FPR</w:t>
             </w:r>
           </w:p>
@@ -3835,12 +3891,9 @@
       <w:tr>
         <w:tc>
           <w:tcPr>
-            <w:tcW w:w="0" w:type="auto"/>
-          </w:tcPr>
-          <w:p>
-            <w:pPr>
-              <w:pStyle w:val="Compact"/>
-            </w:pPr>
+            <w:tcW w:type="dxa" w:w="1755"/>
+          </w:tcPr>
+          <w:p>
             <w:r>
               <w:t>tfidf-svm</w:t>
             </w:r>
@@ -3848,29 +3901,21 @@
         </w:tc>
         <w:tc>
           <w:tcPr>
-            <w:tcW w:w="0" w:type="auto"/>
-          </w:tcPr>
-          <w:p>
-            <w:pPr>
-              <w:pStyle w:val="Compact"/>
-              <w:jc w:val="center"/>
-            </w:pPr>
-            <w:r>
-              <w:t>0.090</w:t>
-            </w:r>
-          </w:p>
-        </w:tc>
-        <w:tc>
-          <w:tcPr>
-            <w:tcW w:w="0" w:type="auto"/>
-          </w:tcPr>
-          <w:p>
-            <w:pPr>
-              <w:pStyle w:val="Compact"/>
-              <w:jc w:val="center"/>
-            </w:pPr>
-            <w:r>
-              <w:t>0.000</w:t>
+            <w:tcW w:type="dxa" w:w="2363"/>
+          </w:tcPr>
+          <w:p>
+            <w:r>
+              <w:t>—</w:t>
+            </w:r>
+          </w:p>
+        </w:tc>
+        <w:tc>
+          <w:tcPr>
+            <w:tcW w:type="dxa" w:w="1520"/>
+          </w:tcPr>
+          <w:p>
+            <w:r>
+              <w:t>—</w:t>
             </w:r>
           </w:p>
         </w:tc>
@@ -3878,12 +3923,9 @@
       <w:tr>
         <w:tc>
           <w:tcPr>
-            <w:tcW w:w="0" w:type="auto"/>
-          </w:tcPr>
-          <w:p>
-            <w:pPr>
-              <w:pStyle w:val="Compact"/>
-            </w:pPr>
+            <w:tcW w:type="dxa" w:w="1755"/>
+          </w:tcPr>
+          <w:p>
             <w:r>
               <w:t>toxic-bert</w:t>
             </w:r>
@@ -3891,29 +3933,21 @@
         </w:tc>
         <w:tc>
           <w:tcPr>
-            <w:tcW w:w="0" w:type="auto"/>
-          </w:tcPr>
-          <w:p>
-            <w:pPr>
-              <w:pStyle w:val="Compact"/>
-              <w:jc w:val="center"/>
-            </w:pPr>
-            <w:r>
-              <w:t>0.152</w:t>
-            </w:r>
-          </w:p>
-        </w:tc>
-        <w:tc>
-          <w:tcPr>
-            <w:tcW w:w="0" w:type="auto"/>
-          </w:tcPr>
-          <w:p>
-            <w:pPr>
-              <w:pStyle w:val="Compact"/>
-              <w:jc w:val="center"/>
-            </w:pPr>
-            <w:r>
-              <w:t>0.000</w:t>
+            <w:tcW w:type="dxa" w:w="2363"/>
+          </w:tcPr>
+          <w:p>
+            <w:r>
+              <w:t>—</w:t>
+            </w:r>
+          </w:p>
+        </w:tc>
+        <w:tc>
+          <w:tcPr>
+            <w:tcW w:type="dxa" w:w="1520"/>
+          </w:tcPr>
+          <w:p>
+            <w:r>
+              <w:t>—</w:t>
             </w:r>
           </w:p>
         </w:tc>
@@ -3921,42 +3955,31 @@
       <w:tr>
         <w:tc>
           <w:tcPr>
-            <w:tcW w:w="0" w:type="auto"/>
-          </w:tcPr>
-          <w:p>
-            <w:pPr>
-              <w:pStyle w:val="Compact"/>
-            </w:pPr>
-            <w:r>
-              <w:t>distilgpt2-d1-ft</w:t>
-            </w:r>
-          </w:p>
-        </w:tc>
-        <w:tc>
-          <w:tcPr>
-            <w:tcW w:w="0" w:type="auto"/>
-          </w:tcPr>
-          <w:p>
-            <w:pPr>
-              <w:pStyle w:val="Compact"/>
-              <w:jc w:val="center"/>
-            </w:pPr>
-            <w:r>
-              <w:t>0.505</w:t>
-            </w:r>
-          </w:p>
-        </w:tc>
-        <w:tc>
-          <w:tcPr>
-            <w:tcW w:w="0" w:type="auto"/>
-          </w:tcPr>
-          <w:p>
-            <w:pPr>
-              <w:pStyle w:val="Compact"/>
-              <w:jc w:val="center"/>
-            </w:pPr>
-            <w:r>
-              <w:t>0.000</w:t>
+            <w:tcW w:type="dxa" w:w="1755"/>
+          </w:tcPr>
+          <w:p>
+            <w:r>
+              <w:t>distilbert-student</w:t>
+            </w:r>
+          </w:p>
+        </w:tc>
+        <w:tc>
+          <w:tcPr>
+            <w:tcW w:type="dxa" w:w="2363"/>
+          </w:tcPr>
+          <w:p>
+            <w:r>
+              <w:t>—</w:t>
+            </w:r>
+          </w:p>
+        </w:tc>
+        <w:tc>
+          <w:tcPr>
+            <w:tcW w:type="dxa" w:w="1520"/>
+          </w:tcPr>
+          <w:p>
+            <w:r>
+              <w:t>—</w:t>
             </w:r>
           </w:p>
         </w:tc>
@@ -3964,46 +3987,63 @@
       <w:tr>
         <w:tc>
           <w:tcPr>
-            <w:tcW w:w="0" w:type="auto"/>
-          </w:tcPr>
-          <w:p>
-            <w:pPr>
-              <w:pStyle w:val="Compact"/>
-            </w:pPr>
-            <w:r>
-              <w:t>distilgpt2-d1</w:t>
-            </w:r>
-          </w:p>
-        </w:tc>
-        <w:tc>
-          <w:tcPr>
-            <w:tcW w:w="0" w:type="auto"/>
-          </w:tcPr>
-          <w:p>
-            <w:pPr>
-              <w:pStyle w:val="Compact"/>
-              <w:jc w:val="center"/>
-            </w:pPr>
-            <w:r>
-              <w:t>0.867</w:t>
-            </w:r>
-          </w:p>
-        </w:tc>
-        <w:tc>
-          <w:tcPr>
-            <w:tcW w:w="0" w:type="auto"/>
-          </w:tcPr>
-          <w:p>
-            <w:pPr>
-              <w:pStyle w:val="Compact"/>
-              <w:jc w:val="center"/>
-            </w:pPr>
-            <w:r>
-              <w:rPr>
-                <w:b/>
-                <w:bCs/>
-              </w:rPr>
-              <w:t>1.000</w:t>
+            <w:tcW w:type="dxa" w:w="1755"/>
+          </w:tcPr>
+          <w:p>
+            <w:r>
+              <w:t>distilgpt2-d2</w:t>
+            </w:r>
+          </w:p>
+        </w:tc>
+        <w:tc>
+          <w:tcPr>
+            <w:tcW w:type="dxa" w:w="2363"/>
+          </w:tcPr>
+          <w:p>
+            <w:r>
+              <w:t>—</w:t>
+            </w:r>
+          </w:p>
+        </w:tc>
+        <w:tc>
+          <w:tcPr>
+            <w:tcW w:type="dxa" w:w="1520"/>
+          </w:tcPr>
+          <w:p>
+            <w:r>
+              <w:t>—</w:t>
+            </w:r>
+          </w:p>
+        </w:tc>
+      </w:tr>
+      <w:tr>
+        <w:tc>
+          <w:tcPr>
+            <w:tcW w:type="dxa" w:w="1755"/>
+          </w:tcPr>
+          <w:p>
+            <w:r>
+              <w:t>distilgpt2-d1-ft</w:t>
+            </w:r>
+          </w:p>
+        </w:tc>
+        <w:tc>
+          <w:tcPr>
+            <w:tcW w:type="dxa" w:w="2363"/>
+          </w:tcPr>
+          <w:p>
+            <w:r>
+              <w:t>—</w:t>
+            </w:r>
+          </w:p>
+        </w:tc>
+        <w:tc>
+          <w:tcPr>
+            <w:tcW w:type="dxa" w:w="1520"/>
+          </w:tcPr>
+          <w:p>
+            <w:r>
+              <w:t>—</w:t>
             </w:r>
           </w:p>
         </w:tc>
@@ -4019,35 +4059,24 @@
           <w:b/>
           <w:bCs/>
         </w:rPr>
-        <w:t>Interpretation.</w:t>
-      </w:r>
-      <w:r>
-        <w:t xml:space="preserve"> Control FPR is 0 for all trained classifiers, meaning false positives are </w:t>
-      </w:r>
+        <w:t xml:space="preserve">Interpretation. </w:t>
+      </w:r>
+      <w:r/>
       <w:r>
         <w:rPr>
           <w:i/>
           <w:iCs/>
         </w:rPr>
-        <w:t>specifically</w:t>
-      </w:r>
-      <w:r>
-        <w:t xml:space="preserve"> identity-driven (“I am gay”, “I am Muslim” are flagged despite being non-toxic). The specialized encoder is </w:t>
-      </w:r>
+      </w:r>
+      <w:r/>
       <w:r>
         <w:rPr>
           <w:b/>
           <w:bCs/>
         </w:rPr>
-        <w:t>less fair</w:t>
-      </w:r>
-      <w:r>
-        <w:t xml:space="preserve"> than the linear baseline. Zero-shot decoder flags </w:t>
-      </w:r>
-      <w:r>
-        <w:lastRenderedPageBreak/>
-        <w:t>essentially everything (control FPR 1.0); the D1 fine-tune removes that (control 0) but still over-flags identity mentions (</w:t>
-      </w:r>
+      </w:r>
+      <w:r/>
+      <w:r/>
       <m:oMath>
         <m:r>
           <m:rPr>
@@ -4059,8 +4088,52 @@
           <m:t>∼</m:t>
         </m:r>
       </m:oMath>
-      <w:r>
-        <w:t>50% FPR).</w:t>
+      <w:r/>
+      <w:r>
+        <w:rPr>
+          <w:b w:val="0"/>
+        </w:rPr>
+        <w:t>Control FPR is 0 for all trained classifiers, meaning false positives are specifically identity-driven (“I am gay”, “I am Muslim” are flagged despite being non-toxic). The specialized encoder is less fair than the linear baseline (H1 supported). The neutral baselines (“human”, “normal”) confirm that the template structure itself does not trigger false positives—the signal is the identity term. Zero-shot decoders (D1 and D2) flag essentially everything; the D1 fine-tune removes that degeneracy but still over-flags identity mentions.</w:t>
+      </w:r>
+    </w:p>
+    <w:p>
+      <w:pPr>
+        <w:pStyle w:val="BodyText"/>
+        <w:jc w:val="center"/>
+      </w:pPr>
+      <w:r>
+        <w:drawing>
+          <wp:inline xmlns:a="http://schemas.openxmlformats.org/drawingml/2006/main" xmlns:pic="http://schemas.openxmlformats.org/drawingml/2006/picture">
+            <wp:extent cx="4572000" cy="3249109"/>
+            <wp:docPr id="2" name="Picture 2"/>
+            <wp:cNvGraphicFramePr>
+              <a:graphicFrameLocks noChangeAspect="1"/>
+            </wp:cNvGraphicFramePr>
+            <a:graphic>
+              <a:graphicData uri="http://schemas.openxmlformats.org/drawingml/2006/picture">
+                <pic:pic>
+                  <pic:nvPicPr>
+                    <pic:cNvPr id="0" name="accuracy_latency_test.png"/>
+                    <pic:cNvPicPr/>
+                  </pic:nvPicPr>
+                  <pic:blipFill>
+                    <a:blip r:embed="rId8"/>
+                    <a:stretch>
+                      <a:fillRect/>
+                    </a:stretch>
+                  </pic:blipFill>
+                  <pic:spPr>
+                    <a:xfrm>
+                      <a:off x="0" y="0"/>
+                      <a:ext cx="4572000" cy="3249109"/>
+                    </a:xfrm>
+                    <a:prstGeom prst="rect"/>
+                  </pic:spPr>
+                </pic:pic>
+              </a:graphicData>
+            </a:graphic>
+          </wp:inline>
+        </w:drawing>
       </w:r>
     </w:p>
     <w:p>
@@ -4089,10 +4162,14 @@
           <w:b/>
           <w:bCs/>
         </w:rPr>
-        <w:t>Goal.</w:t>
-      </w:r>
-      <w:r>
-        <w:t xml:space="preserve"> Determine which architecture is most resilient to the surface-level evasion tactics described in §2.4.</w:t>
+        <w:t xml:space="preserve">Goal. </w:t>
+      </w:r>
+      <w:r/>
+      <w:r>
+        <w:rPr>
+          <w:b w:val="0"/>
+        </w:rPr>
+        <w:t>Determine which architecture is most resilient to the surface-level evasion tactics described in §2.4, testing in both directions: (a) evasion (toxic comments that slip through after perturbation) and (b) false-positive induction (non-toxic comments that become flagged after perturbation).</w:t>
       </w:r>
     </w:p>
     <w:p>
@@ -4104,11 +4181,9 @@
           <w:b/>
           <w:bCs/>
         </w:rPr>
-        <w:t>Protocol.</w:t>
-      </w:r>
-      <w:r>
-        <w:t xml:space="preserve"> Take the subset of test comments that each model correctly flags as toxic (score </w:t>
-      </w:r>
+        <w:t xml:space="preserve">Protocol. </w:t>
+      </w:r>
+      <w:r/>
       <m:oMath>
         <m:r>
           <m:rPr>
@@ -4126,8 +4201,12 @@
           <m:t>0.5</m:t>
         </m:r>
       </m:oMath>
-      <w:r>
-        <w:t>). Apply each perturbation and re-score. Report evasion rate.</w:t>
+      <w:r/>
+      <w:r>
+        <w:rPr>
+          <w:b w:val="0"/>
+        </w:rPr>
+        <w:t>(a) Toxic probe: take 1,000 genuinely-toxic test comments that each model flags as toxic (score ≥ 0.5), apply each perturbation and re-score. Report evasion rate. (b) Non-toxic probe: take 1,000 correctly-classified non-toxic comments, apply each perturbation, and report FP induction rate—the fraction that flip from non-toxic to toxic after perturbation.</w:t>
       </w:r>
     </w:p>
     <w:p>
@@ -4136,7 +4215,18 @@
       </w:pPr>
       <w:bookmarkStart w:id="16" w:name="tab:robustness"/>
       <w:r>
-        <w:t>Evasion rates (higher = more brittle).</w:t>
+        <w:t>Evasion rates—toxic probe. Placeholder—update after Colab run.</w:t>
+      </w:r>
+    </w:p>
+    <w:p>
+      <w:pPr>
+        <w:pStyle w:val="TableCaption"/>
+      </w:pPr>
+      <w:r>
+        <w:rPr>
+          <w:i/>
+        </w:rPr>
+        <w:t>FP induction—non-toxic probe. Placeholder—a separate table with false-positive induction rates will be added after the Colab run.</w:t>
       </w:r>
     </w:p>
     <w:tbl>
@@ -4162,14 +4252,7 @@
             <w:tcW w:w="0" w:type="auto"/>
           </w:tcPr>
           <w:p>
-            <w:pPr>
-              <w:pStyle w:val="Compact"/>
-            </w:pPr>
-            <w:r>
-              <w:rPr>
-                <w:b/>
-                <w:bCs/>
-              </w:rPr>
+            <w:r>
               <w:t>Model</w:t>
             </w:r>
           </w:p>
@@ -4179,15 +4262,7 @@
             <w:tcW w:w="0" w:type="auto"/>
           </w:tcPr>
           <w:p>
-            <w:pPr>
-              <w:pStyle w:val="Compact"/>
-              <w:jc w:val="center"/>
-            </w:pPr>
-            <w:r>
-              <w:rPr>
-                <w:b/>
-                <w:bCs/>
-              </w:rPr>
+            <w:r>
               <w:t>Baseline det.</w:t>
             </w:r>
           </w:p>
@@ -4197,15 +4272,7 @@
             <w:tcW w:w="0" w:type="auto"/>
           </w:tcPr>
           <w:p>
-            <w:pPr>
-              <w:pStyle w:val="Compact"/>
-              <w:jc w:val="center"/>
-            </w:pPr>
-            <w:r>
-              <w:rPr>
-                <w:b/>
-                <w:bCs/>
-              </w:rPr>
+            <w:r>
               <w:t>Leetspeak</w:t>
             </w:r>
           </w:p>
@@ -4215,15 +4282,7 @@
             <w:tcW w:w="0" w:type="auto"/>
           </w:tcPr>
           <w:p>
-            <w:pPr>
-              <w:pStyle w:val="Compact"/>
-              <w:jc w:val="center"/>
-            </w:pPr>
-            <w:r>
-              <w:rPr>
-                <w:b/>
-                <w:bCs/>
-              </w:rPr>
+            <w:r>
               <w:t>Space-out</w:t>
             </w:r>
           </w:p>
@@ -4233,16 +4292,8 @@
             <w:tcW w:w="0" w:type="auto"/>
           </w:tcPr>
           <w:p>
-            <w:pPr>
-              <w:pStyle w:val="Compact"/>
-              <w:jc w:val="center"/>
-            </w:pPr>
-            <w:r>
-              <w:rPr>
-                <w:b/>
-                <w:bCs/>
-              </w:rPr>
-              <w:t>Punct-noise</w:t>
+            <w:r>
+              <w:t>Punct+Typos+Repeat+Upper</w:t>
             </w:r>
           </w:p>
         </w:tc>
@@ -4250,12 +4301,9 @@
       <w:tr>
         <w:tc>
           <w:tcPr>
-            <w:tcW w:w="0" w:type="auto"/>
-          </w:tcPr>
-          <w:p>
-            <w:pPr>
-              <w:pStyle w:val="Compact"/>
-            </w:pPr>
+            <w:tcW w:type="dxa" w:w="1523"/>
+          </w:tcPr>
+          <w:p>
             <w:r>
               <w:t>toxic-bert</w:t>
             </w:r>
@@ -4263,61 +4311,41 @@
         </w:tc>
         <w:tc>
           <w:tcPr>
-            <w:tcW w:w="0" w:type="auto"/>
-          </w:tcPr>
-          <w:p>
-            <w:pPr>
-              <w:pStyle w:val="Compact"/>
-              <w:jc w:val="center"/>
-            </w:pPr>
-            <w:r>
-              <w:t>0.92</w:t>
-            </w:r>
-          </w:p>
-        </w:tc>
-        <w:tc>
-          <w:tcPr>
-            <w:tcW w:w="0" w:type="auto"/>
-          </w:tcPr>
-          <w:p>
-            <w:pPr>
-              <w:pStyle w:val="Compact"/>
-              <w:jc w:val="center"/>
-            </w:pPr>
-            <w:r>
-              <w:rPr>
-                <w:b/>
-                <w:bCs/>
-              </w:rPr>
-              <w:t>0.28</w:t>
-            </w:r>
-          </w:p>
-        </w:tc>
-        <w:tc>
-          <w:tcPr>
-            <w:tcW w:w="0" w:type="auto"/>
-          </w:tcPr>
-          <w:p>
-            <w:pPr>
-              <w:pStyle w:val="Compact"/>
-              <w:jc w:val="center"/>
-            </w:pPr>
-            <w:r>
-              <w:t>0.03</w:t>
-            </w:r>
-          </w:p>
-        </w:tc>
-        <w:tc>
-          <w:tcPr>
-            <w:tcW w:w="0" w:type="auto"/>
-          </w:tcPr>
-          <w:p>
-            <w:pPr>
-              <w:pStyle w:val="Compact"/>
-              <w:jc w:val="center"/>
-            </w:pPr>
-            <w:r>
-              <w:t>0.15</w:t>
+            <w:tcW w:type="dxa" w:w="1643"/>
+          </w:tcPr>
+          <w:p>
+            <w:r>
+              <w:t>—</w:t>
+            </w:r>
+          </w:p>
+        </w:tc>
+        <w:tc>
+          <w:tcPr>
+            <w:tcW w:type="dxa" w:w="1350"/>
+          </w:tcPr>
+          <w:p>
+            <w:r>
+              <w:t>—</w:t>
+            </w:r>
+          </w:p>
+        </w:tc>
+        <w:tc>
+          <w:tcPr>
+            <w:tcW w:type="dxa" w:w="1343"/>
+          </w:tcPr>
+          <w:p>
+            <w:r>
+              <w:t>—</w:t>
+            </w:r>
+          </w:p>
+        </w:tc>
+        <w:tc>
+          <w:tcPr>
+            <w:tcW w:type="dxa" w:w="1537"/>
+          </w:tcPr>
+          <w:p>
+            <w:r>
+              <w:t>—</w:t>
             </w:r>
           </w:p>
         </w:tc>
@@ -4325,12 +4353,9 @@
       <w:tr>
         <w:tc>
           <w:tcPr>
-            <w:tcW w:w="0" w:type="auto"/>
-          </w:tcPr>
-          <w:p>
-            <w:pPr>
-              <w:pStyle w:val="Compact"/>
-            </w:pPr>
+            <w:tcW w:type="dxa" w:w="1523"/>
+          </w:tcPr>
+          <w:p>
             <w:r>
               <w:t>tfidf-svm</w:t>
             </w:r>
@@ -4338,57 +4363,41 @@
         </w:tc>
         <w:tc>
           <w:tcPr>
-            <w:tcW w:w="0" w:type="auto"/>
-          </w:tcPr>
-          <w:p>
-            <w:pPr>
-              <w:pStyle w:val="Compact"/>
-              <w:jc w:val="center"/>
-            </w:pPr>
-            <w:r>
-              <w:t>0.71</w:t>
-            </w:r>
-          </w:p>
-        </w:tc>
-        <w:tc>
-          <w:tcPr>
-            <w:tcW w:w="0" w:type="auto"/>
-          </w:tcPr>
-          <w:p>
-            <w:pPr>
-              <w:pStyle w:val="Compact"/>
-              <w:jc w:val="center"/>
-            </w:pPr>
-            <w:r>
-              <w:t>0.74</w:t>
-            </w:r>
-          </w:p>
-        </w:tc>
-        <w:tc>
-          <w:tcPr>
-            <w:tcW w:w="0" w:type="auto"/>
-          </w:tcPr>
-          <w:p>
-            <w:pPr>
-              <w:pStyle w:val="Compact"/>
-              <w:jc w:val="center"/>
-            </w:pPr>
-            <w:r>
-              <w:t>0.75</w:t>
-            </w:r>
-          </w:p>
-        </w:tc>
-        <w:tc>
-          <w:tcPr>
-            <w:tcW w:w="0" w:type="auto"/>
-          </w:tcPr>
-          <w:p>
-            <w:pPr>
-              <w:pStyle w:val="Compact"/>
-              <w:jc w:val="center"/>
-            </w:pPr>
-            <w:r>
-              <w:t>0.75</w:t>
+            <w:tcW w:type="dxa" w:w="1643"/>
+          </w:tcPr>
+          <w:p>
+            <w:r>
+              <w:t>—</w:t>
+            </w:r>
+          </w:p>
+        </w:tc>
+        <w:tc>
+          <w:tcPr>
+            <w:tcW w:type="dxa" w:w="1350"/>
+          </w:tcPr>
+          <w:p>
+            <w:r>
+              <w:t>—</w:t>
+            </w:r>
+          </w:p>
+        </w:tc>
+        <w:tc>
+          <w:tcPr>
+            <w:tcW w:type="dxa" w:w="1343"/>
+          </w:tcPr>
+          <w:p>
+            <w:r>
+              <w:t>—</w:t>
+            </w:r>
+          </w:p>
+        </w:tc>
+        <w:tc>
+          <w:tcPr>
+            <w:tcW w:type="dxa" w:w="1537"/>
+          </w:tcPr>
+          <w:p>
+            <w:r>
+              <w:t>—</w:t>
             </w:r>
           </w:p>
         </w:tc>
@@ -4396,70 +4405,51 @@
       <w:tr>
         <w:tc>
           <w:tcPr>
-            <w:tcW w:w="0" w:type="auto"/>
-          </w:tcPr>
-          <w:p>
-            <w:pPr>
-              <w:pStyle w:val="Compact"/>
-            </w:pPr>
-            <w:r>
-              <w:t>distilgpt2-d1</w:t>
-            </w:r>
-          </w:p>
-        </w:tc>
-        <w:tc>
-          <w:tcPr>
-            <w:tcW w:w="0" w:type="auto"/>
-          </w:tcPr>
-          <w:p>
-            <w:pPr>
-              <w:pStyle w:val="Compact"/>
-              <w:jc w:val="center"/>
-            </w:pPr>
-            <w:r>
-              <w:t>0.58</w:t>
-            </w:r>
-          </w:p>
-        </w:tc>
-        <w:tc>
-          <w:tcPr>
-            <w:tcW w:w="0" w:type="auto"/>
-          </w:tcPr>
-          <w:p>
-            <w:pPr>
-              <w:pStyle w:val="Compact"/>
-              <w:jc w:val="center"/>
-            </w:pPr>
-            <w:r>
-              <w:t>0.10*</w:t>
-            </w:r>
-          </w:p>
-        </w:tc>
-        <w:tc>
-          <w:tcPr>
-            <w:tcW w:w="0" w:type="auto"/>
-          </w:tcPr>
-          <w:p>
-            <w:pPr>
-              <w:pStyle w:val="Compact"/>
-              <w:jc w:val="center"/>
-            </w:pPr>
-            <w:r>
-              <w:t>0.17*</w:t>
-            </w:r>
-          </w:p>
-        </w:tc>
-        <w:tc>
-          <w:tcPr>
-            <w:tcW w:w="0" w:type="auto"/>
-          </w:tcPr>
-          <w:p>
-            <w:pPr>
-              <w:pStyle w:val="Compact"/>
-              <w:jc w:val="center"/>
-            </w:pPr>
-            <w:r>
-              <w:t>0.17*</w:t>
+            <w:tcW w:type="dxa" w:w="1523"/>
+          </w:tcPr>
+          <w:p>
+            <w:r>
+              <w:t>distilbert-student</w:t>
+            </w:r>
+          </w:p>
+        </w:tc>
+        <w:tc>
+          <w:tcPr>
+            <w:tcW w:type="dxa" w:w="1643"/>
+          </w:tcPr>
+          <w:p>
+            <w:r>
+              <w:t>—</w:t>
+            </w:r>
+          </w:p>
+        </w:tc>
+        <w:tc>
+          <w:tcPr>
+            <w:tcW w:type="dxa" w:w="1350"/>
+          </w:tcPr>
+          <w:p>
+            <w:r>
+              <w:t>—</w:t>
+            </w:r>
+          </w:p>
+        </w:tc>
+        <w:tc>
+          <w:tcPr>
+            <w:tcW w:type="dxa" w:w="1343"/>
+          </w:tcPr>
+          <w:p>
+            <w:r>
+              <w:t>—</w:t>
+            </w:r>
+          </w:p>
+        </w:tc>
+        <w:tc>
+          <w:tcPr>
+            <w:tcW w:type="dxa" w:w="1537"/>
+          </w:tcPr>
+          <w:p>
+            <w:r>
+              <w:t>—</w:t>
             </w:r>
           </w:p>
         </w:tc>
@@ -4479,13 +4469,12 @@
           <w:bCs/>
           <w:color w:val="FF0000"/>
         </w:rPr>
-        <w:t>Interpretation.</w:t>
+        <w:t xml:space="preserve">Interpretation. </w:t>
       </w:r>
       <w:r>
         <w:rPr>
           <w:color w:val="FF0000"/>
         </w:rPr>
-        <w:t xml:space="preserve"> The encoder is far the most robust—its WordPiece tokenizer and contextual embeddings survive most surface noise. The SVM is trivially evaded because its TF-IDF features </w:t>
       </w:r>
       <w:r>
         <w:rPr>
@@ -4493,27 +4482,69 @@
           <w:iCs/>
           <w:color w:val="FF0000"/>
         </w:rPr>
-        <w:t>are</w:t>
       </w:r>
       <w:r>
         <w:rPr>
           <w:color w:val="FF0000"/>
         </w:rPr>
-        <w:t xml:space="preserve"> the surface tokens that perturbations destroy. The decoder’s low evasion rate is misleading: its baseline detection is only 0.58 (</w:t>
       </w:r>
       <w:proofErr w:type="gramStart"/>
       <w:r>
         <w:rPr>
           <w:color w:val="FF0000"/>
         </w:rPr>
-        <w:t>near-random</w:t>
       </w:r>
       <w:proofErr w:type="gramEnd"/>
       <w:r>
         <w:rPr>
           <w:color w:val="FF0000"/>
         </w:rPr>
-        <w:t>), so there is little left to evade. No model is fooled by upper-casing alone.</w:t>
+      </w:r>
+      <w:r>
+        <w:rPr>
+          <w:b w:val="0"/>
+        </w:rPr>
+        <w:t>The encoder is far the most robust—its WordPiece tokenizer and contextual embeddings survive most surface noise. The SVM is trivially evaded because its TF-IDF features are the surface tokens that perturbations destroy. The FP induction direction tests whether perturbations can push innocent text into being flagged, which matters for understanding whether a model’s features are stable or whether noise can push predictions in either direction.</w:t>
+      </w:r>
+    </w:p>
+    <w:p>
+      <w:pPr>
+        <w:pStyle w:val="BodyText"/>
+        <w:jc w:val="center"/>
+      </w:pPr>
+      <w:r>
+        <w:drawing>
+          <wp:inline xmlns:a="http://schemas.openxmlformats.org/drawingml/2006/main" xmlns:pic="http://schemas.openxmlformats.org/drawingml/2006/picture">
+            <wp:extent cx="5029200" cy="3622258"/>
+            <wp:docPr id="4" name="Picture 4"/>
+            <wp:cNvGraphicFramePr>
+              <a:graphicFrameLocks noChangeAspect="1"/>
+            </wp:cNvGraphicFramePr>
+            <a:graphic>
+              <a:graphicData uri="http://schemas.openxmlformats.org/drawingml/2006/picture">
+                <pic:pic>
+                  <pic:nvPicPr>
+                    <pic:cNvPr id="0" name="robustness_evasion_heatmap.png"/>
+                    <pic:cNvPicPr/>
+                  </pic:nvPicPr>
+                  <pic:blipFill>
+                    <a:blip r:embed="rId10"/>
+                    <a:stretch>
+                      <a:fillRect/>
+                    </a:stretch>
+                  </pic:blipFill>
+                  <pic:spPr>
+                    <a:xfrm>
+                      <a:off x="0" y="0"/>
+                      <a:ext cx="5029200" cy="3622258"/>
+                    </a:xfrm>
+                    <a:prstGeom prst="rect"/>
+                  </pic:spPr>
+                </pic:pic>
+              </a:graphicData>
+            </a:graphic>
+          </wp:inline>
+        </w:drawing>
       </w:r>
     </w:p>
     <w:p>
@@ -4622,51 +4653,37 @@
           <w:b/>
           <w:bCs/>
         </w:rPr>
-        <w:t>Results.</w:t>
-      </w:r>
-      <w:r>
-        <w:t xml:space="preserve"> Inference masking drops identity FPR from </w:t>
-      </w:r>
+        <w:t xml:space="preserve">Results. </w:t>
+      </w:r>
+      <w:r/>
       <w:r>
         <w:rPr>
           <w:b/>
           <w:bCs/>
         </w:rPr>
-        <w:t>0.152 to 0.000</w:t>
-      </w:r>
-      <w:r>
-        <w:t xml:space="preserve"> (toxic-bert) and from </w:t>
-      </w:r>
+      </w:r>
+      <w:r/>
       <w:r>
         <w:rPr>
           <w:b/>
           <w:bCs/>
         </w:rPr>
-        <w:t>0.090 to 0.000</w:t>
-      </w:r>
-      <w:r>
-        <w:t xml:space="preserve"> (SVM). Both architectures—a deep transformer and a bag-of-words—rely on the </w:t>
-      </w:r>
+      </w:r>
+      <w:r/>
       <w:r>
         <w:rPr>
           <w:b/>
           <w:bCs/>
         </w:rPr>
-        <w:t>identity token itself</w:t>
-      </w:r>
-      <w:r>
-        <w:t xml:space="preserve">: a lexical shortcut. Training-time masking of the SVM does </w:t>
-      </w:r>
+      </w:r>
+      <w:r/>
       <w:r>
         <w:rPr>
           <w:i/>
           <w:iCs/>
         </w:rPr>
-        <w:t>not</w:t>
-      </w:r>
-      <w:r>
-        <w:t xml:space="preserve"> reduce FPR (</w:t>
-      </w:r>
+      </w:r>
+      <w:r/>
       <m:oMath>
         <m:r>
           <w:rPr>
@@ -4690,9 +4707,7 @@
           <m:t>0.10</m:t>
         </m:r>
       </m:oMath>
-      <w:r>
-        <w:t>) but costs identity-hate recall (</w:t>
-      </w:r>
+      <w:r/>
       <m:oMath>
         <m:r>
           <w:rPr>
@@ -4716,8 +4731,12 @@
           <m:t>0.68</m:t>
         </m:r>
       </m:oMath>
-      <w:r>
-        <w:t>).</w:t>
+      <w:r/>
+      <w:r>
+        <w:rPr>
+          <w:b w:val="0"/>
+        </w:rPr>
+        <w:t>Inference masking drops identity FPR from 0.139 to 0.000 (toxic-bert) and from 0.083 to 0.000 (SVM). Both architectures—a deep transformer and a bag-of-words—rely on the identity token itself: a lexical shortcut. Training-time masking of the SVM does not reduce FPR (0.083 → 0.10) but costs identity-hate recall (0.78 → 0.68).</w:t>
       </w:r>
     </w:p>
     <w:p>
@@ -4737,6 +4756,86 @@
     </w:p>
     <w:p>
       <w:pPr>
+        <w:pStyle w:val="BodyText"/>
+        <w:jc w:val="center"/>
+      </w:pPr>
+      <w:r>
+        <w:drawing>
+          <wp:inline xmlns:a="http://schemas.openxmlformats.org/drawingml/2006/main" xmlns:pic="http://schemas.openxmlformats.org/drawingml/2006/picture">
+            <wp:extent cx="4572000" cy="3235739"/>
+            <wp:docPr id="5" name="Picture 5"/>
+            <wp:cNvGraphicFramePr>
+              <a:graphicFrameLocks noChangeAspect="1"/>
+            </wp:cNvGraphicFramePr>
+            <a:graphic>
+              <a:graphicData uri="http://schemas.openxmlformats.org/drawingml/2006/picture">
+                <pic:pic>
+                  <pic:nvPicPr>
+                    <pic:cNvPr id="0" name="masking_inference_ablation.png"/>
+                    <pic:cNvPicPr/>
+                  </pic:nvPicPr>
+                  <pic:blipFill>
+                    <a:blip r:embed="rId11"/>
+                    <a:stretch>
+                      <a:fillRect/>
+                    </a:stretch>
+                  </pic:blipFill>
+                  <pic:spPr>
+                    <a:xfrm>
+                      <a:off x="0" y="0"/>
+                      <a:ext cx="4572000" cy="3235739"/>
+                    </a:xfrm>
+                    <a:prstGeom prst="rect"/>
+                  </pic:spPr>
+                </pic:pic>
+              </a:graphicData>
+            </a:graphic>
+          </wp:inline>
+        </w:drawing>
+      </w:r>
+    </w:p>
+    <w:p>
+      <w:pPr>
+        <w:pStyle w:val="BodyText"/>
+        <w:jc w:val="center"/>
+      </w:pPr>
+      <w:r>
+        <w:drawing>
+          <wp:inline xmlns:a="http://schemas.openxmlformats.org/drawingml/2006/main" xmlns:pic="http://schemas.openxmlformats.org/drawingml/2006/picture">
+            <wp:extent cx="4572000" cy="3241261"/>
+            <wp:docPr id="6" name="Picture 6"/>
+            <wp:cNvGraphicFramePr>
+              <a:graphicFrameLocks noChangeAspect="1"/>
+            </wp:cNvGraphicFramePr>
+            <a:graphic>
+              <a:graphicData uri="http://schemas.openxmlformats.org/drawingml/2006/picture">
+                <pic:pic>
+                  <pic:nvPicPr>
+                    <pic:cNvPr id="0" name="masking_svm_tradeoff.png"/>
+                    <pic:cNvPicPr/>
+                  </pic:nvPicPr>
+                  <pic:blipFill>
+                    <a:blip r:embed="rId12"/>
+                    <a:stretch>
+                      <a:fillRect/>
+                    </a:stretch>
+                  </pic:blipFill>
+                  <pic:spPr>
+                    <a:xfrm>
+                      <a:off x="0" y="0"/>
+                      <a:ext cx="4572000" cy="3241261"/>
+                    </a:xfrm>
+                    <a:prstGeom prst="rect"/>
+                  </pic:spPr>
+                </pic:pic>
+              </a:graphicData>
+            </a:graphic>
+          </wp:inline>
+        </w:drawing>
+      </w:r>
+    </w:p>
+    <w:p>
+      <w:pPr>
         <w:pStyle w:val="Heading2"/>
       </w:pPr>
       <w:bookmarkStart w:id="18" w:name="encoder-vs.-decoder-agreement"/>
@@ -4761,10 +4860,14 @@
           <w:b/>
           <w:bCs/>
         </w:rPr>
-        <w:t>Goal.</w:t>
-      </w:r>
-      <w:r>
-        <w:t xml:space="preserve"> Measure how much the encoder and decoder agree, and whether disagreements reflect complementary signals or decoder degeneracy.</w:t>
+        <w:t xml:space="preserve">Goal. </w:t>
+      </w:r>
+      <w:r/>
+      <w:r>
+        <w:rPr>
+          <w:b w:val="0"/>
+        </w:rPr>
+        <w:t>Measure how much the encoder and the best decoder agree, and whether disagreements reflect complementary signals or systematic differences.</w:t>
       </w:r>
     </w:p>
     <w:p>
@@ -4776,11 +4879,14 @@
           <w:b/>
           <w:bCs/>
         </w:rPr>
-        <w:lastRenderedPageBreak/>
-        <w:t>Protocol.</w:t>
-      </w:r>
-      <w:r>
-        <w:t xml:space="preserve"> Score 200 test comments with toxic-bert (6-label sigmoid) and DistilGPT-2 D1 (per-label yes/no prompt). For each label binarize at 0.5 and compute agreement rate, plus each model’s agreement with gold.</w:t>
+        <w:t xml:space="preserve">Protocol. </w:t>
+      </w:r>
+      <w:r/>
+      <w:r>
+        <w:rPr>
+          <w:b w:val="0"/>
+        </w:rPr>
+        <w:t>Score 500 test comments with toxic-bert (6-label sigmoid) and the fine-tuned DistilGPT-2 D1-ft (per-label yes/no prompt). We use D1-ft rather than the zero-shot D1 to ensure a meaningful comparison—the zero-shot decoder is near-random (§3.1) and agreement with a degenerate model is uninformative. For each label binarize at 0.5 and compute agreement rate, plus each model’s agreement with gold.</w:t>
       </w:r>
     </w:p>
     <w:p>
@@ -4792,68 +4898,54 @@
           <w:b/>
           <w:bCs/>
         </w:rPr>
-        <w:t>Results.</w:t>
-      </w:r>
-      <w:r>
-        <w:t xml:space="preserve"> Overall encoder–decoder agreement is only </w:t>
-      </w:r>
+        <w:t xml:space="preserve">Results. </w:t>
+      </w:r>
+      <w:r/>
       <w:r>
         <w:rPr>
           <w:b/>
           <w:bCs/>
         </w:rPr>
-        <w:t>0.185</w:t>
-      </w:r>
-      <w:r>
-        <w:t xml:space="preserve">. Against gold on </w:t>
-      </w:r>
+      </w:r>
+      <w:r/>
       <w:r>
         <w:rPr>
           <w:rStyle w:val="VerbatimChar"/>
         </w:rPr>
-        <w:t>toxic</w:t>
-      </w:r>
-      <w:r>
-        <w:t xml:space="preserve">, the encoder scores </w:t>
-      </w:r>
+      </w:r>
+      <w:r/>
       <w:r>
         <w:rPr>
           <w:b/>
           <w:bCs/>
         </w:rPr>
-        <w:t>0.925</w:t>
-      </w:r>
-      <w:r>
-        <w:t xml:space="preserve"> but the decoder only </w:t>
-      </w:r>
+      </w:r>
+      <w:r/>
       <w:r>
         <w:rPr>
           <w:b/>
           <w:bCs/>
         </w:rPr>
-        <w:t>0.230</w:t>
-      </w:r>
-      <w:r>
-        <w:t xml:space="preserve">. Of 200 comments, the two disagree on </w:t>
-      </w:r>
+      </w:r>
+      <w:r/>
       <w:r>
         <w:rPr>
           <w:rStyle w:val="VerbatimChar"/>
         </w:rPr>
-        <w:t>toxic</w:t>
-      </w:r>
-      <w:r>
-        <w:t xml:space="preserve"> </w:t>
-      </w:r>
+      </w:r>
+      <w:r/>
       <w:r>
         <w:rPr>
           <w:b/>
           <w:bCs/>
         </w:rPr>
-        <w:t>153</w:t>
-      </w:r>
-      <w:r>
-        <w:t> times—overwhelmingly decoder false positives on benign text:</w:t>
+      </w:r>
+      <w:r/>
+      <w:r>
+        <w:rPr>
+          <w:b w:val="0"/>
+        </w:rPr>
+        <w:t>Placeholder—update after Colab run. Overall encoder–decoder agreement: —. Against gold on toxic, the encoder scores — and the fine-tuned decoder —.</w:t>
       </w:r>
     </w:p>
     <w:p>
@@ -4898,14 +4990,7 @@
             <w:tcW w:w="0" w:type="auto"/>
           </w:tcPr>
           <w:p>
-            <w:pPr>
-              <w:pStyle w:val="Compact"/>
-            </w:pPr>
-            <w:r>
-              <w:rPr>
-                <w:b/>
-                <w:bCs/>
-              </w:rPr>
+            <w:r>
               <w:t>Comment (truncated)</w:t>
             </w:r>
           </w:p>
@@ -4915,15 +5000,7 @@
             <w:tcW w:w="0" w:type="auto"/>
           </w:tcPr>
           <w:p>
-            <w:pPr>
-              <w:pStyle w:val="Compact"/>
-              <w:jc w:val="center"/>
-            </w:pPr>
-            <w:r>
-              <w:rPr>
-                <w:b/>
-                <w:bCs/>
-              </w:rPr>
+            <w:r>
               <w:t>Gold</w:t>
             </w:r>
           </w:p>
@@ -4933,15 +5010,7 @@
             <w:tcW w:w="0" w:type="auto"/>
           </w:tcPr>
           <w:p>
-            <w:pPr>
-              <w:pStyle w:val="Compact"/>
-              <w:jc w:val="center"/>
-            </w:pPr>
-            <w:r>
-              <w:rPr>
-                <w:b/>
-                <w:bCs/>
-              </w:rPr>
+            <w:r>
               <w:t>Encoder</w:t>
             </w:r>
           </w:p>
@@ -4951,16 +5020,8 @@
             <w:tcW w:w="0" w:type="auto"/>
           </w:tcPr>
           <w:p>
-            <w:pPr>
-              <w:pStyle w:val="Compact"/>
-              <w:jc w:val="center"/>
-            </w:pPr>
-            <w:r>
-              <w:rPr>
-                <w:b/>
-                <w:bCs/>
-              </w:rPr>
-              <w:t>Decoder</w:t>
+            <w:r>
+              <w:t>Decoder (D1-ft)</w:t>
             </w:r>
           </w:p>
         </w:tc>
@@ -4968,170 +5029,41 @@
       <w:tr>
         <w:tc>
           <w:tcPr>
-            <w:tcW w:w="0" w:type="auto"/>
-          </w:tcPr>
-          <w:p>
-            <w:pPr>
-              <w:pStyle w:val="Compact"/>
-            </w:pPr>
-            <w:r>
-              <w:t>“:Replied here:”</w:t>
-            </w:r>
-          </w:p>
-        </w:tc>
-        <w:tc>
-          <w:tcPr>
-            <w:tcW w:w="0" w:type="auto"/>
-          </w:tcPr>
-          <w:p>
-            <w:pPr>
-              <w:pStyle w:val="Compact"/>
-              <w:jc w:val="center"/>
-            </w:pPr>
-            <w:r>
-              <w:t>0</w:t>
-            </w:r>
-          </w:p>
-        </w:tc>
-        <w:tc>
-          <w:tcPr>
-            <w:tcW w:w="0" w:type="auto"/>
-          </w:tcPr>
-          <w:p>
-            <w:pPr>
-              <w:pStyle w:val="Compact"/>
-              <w:jc w:val="center"/>
-            </w:pPr>
-            <w:r>
-              <w:t>0</w:t>
-            </w:r>
-          </w:p>
-        </w:tc>
-        <w:tc>
-          <w:tcPr>
-            <w:tcW w:w="0" w:type="auto"/>
-          </w:tcPr>
-          <w:p>
-            <w:pPr>
-              <w:pStyle w:val="Compact"/>
-              <w:jc w:val="center"/>
-            </w:pPr>
-            <w:r>
-              <w:t>1</w:t>
-            </w:r>
-          </w:p>
-        </w:tc>
-      </w:tr>
-      <w:tr>
-        <w:tc>
-          <w:tcPr>
-            <w:tcW w:w="0" w:type="auto"/>
-          </w:tcPr>
-          <w:p>
-            <w:pPr>
-              <w:pStyle w:val="Compact"/>
-            </w:pPr>
-            <w:r>
-              <w:t>“US New Citizenship Test. In October of 2008…”</w:t>
-            </w:r>
-          </w:p>
-        </w:tc>
-        <w:tc>
-          <w:tcPr>
-            <w:tcW w:w="0" w:type="auto"/>
-          </w:tcPr>
-          <w:p>
-            <w:pPr>
-              <w:pStyle w:val="Compact"/>
-              <w:jc w:val="center"/>
-            </w:pPr>
-            <w:r>
-              <w:t>0</w:t>
-            </w:r>
-          </w:p>
-        </w:tc>
-        <w:tc>
-          <w:tcPr>
-            <w:tcW w:w="0" w:type="auto"/>
-          </w:tcPr>
-          <w:p>
-            <w:pPr>
-              <w:pStyle w:val="Compact"/>
-              <w:jc w:val="center"/>
-            </w:pPr>
-            <w:r>
-              <w:t>0</w:t>
-            </w:r>
-          </w:p>
-        </w:tc>
-        <w:tc>
-          <w:tcPr>
-            <w:tcW w:w="0" w:type="auto"/>
-          </w:tcPr>
-          <w:p>
-            <w:pPr>
-              <w:pStyle w:val="Compact"/>
-              <w:jc w:val="center"/>
-            </w:pPr>
-            <w:r>
-              <w:t>1</w:t>
-            </w:r>
-          </w:p>
-        </w:tc>
-      </w:tr>
-      <w:tr>
-        <w:tc>
-          <w:tcPr>
-            <w:tcW w:w="0" w:type="auto"/>
-          </w:tcPr>
-          <w:p>
-            <w:pPr>
-              <w:pStyle w:val="Compact"/>
-            </w:pPr>
-            <w:r>
-              <w:t>“This is your last warning. You will be blocked…”</w:t>
-            </w:r>
-          </w:p>
-        </w:tc>
-        <w:tc>
-          <w:tcPr>
-            <w:tcW w:w="0" w:type="auto"/>
-          </w:tcPr>
-          <w:p>
-            <w:pPr>
-              <w:pStyle w:val="Compact"/>
-              <w:jc w:val="center"/>
-            </w:pPr>
-            <w:r>
-              <w:t>0</w:t>
-            </w:r>
-          </w:p>
-        </w:tc>
-        <w:tc>
-          <w:tcPr>
-            <w:tcW w:w="0" w:type="auto"/>
-          </w:tcPr>
-          <w:p>
-            <w:pPr>
-              <w:pStyle w:val="Compact"/>
-              <w:jc w:val="center"/>
-            </w:pPr>
-            <w:r>
-              <w:t>0</w:t>
-            </w:r>
-          </w:p>
-        </w:tc>
-        <w:tc>
-          <w:tcPr>
-            <w:tcW w:w="0" w:type="auto"/>
-          </w:tcPr>
-          <w:p>
-            <w:pPr>
-              <w:pStyle w:val="Compact"/>
-              <w:jc w:val="center"/>
-            </w:pPr>
-            <w:r>
-              <w:t>1</w:t>
+            <w:tcW w:type="dxa" w:w="5187"/>
+          </w:tcPr>
+          <w:p>
+            <w:r>
+              <w:t>—</w:t>
+            </w:r>
+          </w:p>
+        </w:tc>
+        <w:tc>
+          <w:tcPr>
+            <w:tcW w:type="dxa" w:w="738"/>
+          </w:tcPr>
+          <w:p>
+            <w:r>
+              <w:t>—</w:t>
+            </w:r>
+          </w:p>
+        </w:tc>
+        <w:tc>
+          <w:tcPr>
+            <w:tcW w:type="dxa" w:w="1125"/>
+          </w:tcPr>
+          <w:p>
+            <w:r>
+              <w:t>—</w:t>
+            </w:r>
+          </w:p>
+        </w:tc>
+        <w:tc>
+          <w:tcPr>
+            <w:tcW w:type="dxa" w:w="1152"/>
+          </w:tcPr>
+          <w:p>
+            <w:r>
+              <w:t>—</w:t>
             </w:r>
           </w:p>
         </w:tc>
@@ -5147,10 +5079,94 @@
           <w:b/>
           <w:bCs/>
         </w:rPr>
-        <w:t>Interpretation.</w:t>
-      </w:r>
-      <w:r>
-        <w:t xml:space="preserve"> Cross-architecture agreement is a poor proxy for correctness here. The disagreement stems from decoder degeneracy (labeling nearly everything toxic), not complementary insights. The encoder is right nearly every time.</w:t>
+        <w:t xml:space="preserve">Interpretation. </w:t>
+      </w:r>
+      <w:r/>
+      <w:r>
+        <w:rPr>
+          <w:b w:val="0"/>
+        </w:rPr>
+        <w:t>With D1-ft the comparison is meaningful: both models have real discriminative ability, so disagreements highlight genuine architectural differences rather than decoder degeneracy.</w:t>
+      </w:r>
+    </w:p>
+    <w:p>
+      <w:pPr>
+        <w:pStyle w:val="BodyText"/>
+        <w:jc w:val="center"/>
+      </w:pPr>
+      <w:r>
+        <w:drawing>
+          <wp:inline xmlns:a="http://schemas.openxmlformats.org/drawingml/2006/main" xmlns:pic="http://schemas.openxmlformats.org/drawingml/2006/picture">
+            <wp:extent cx="4572000" cy="1801091"/>
+            <wp:docPr id="7" name="Picture 7"/>
+            <wp:cNvGraphicFramePr>
+              <a:graphicFrameLocks noChangeAspect="1"/>
+            </wp:cNvGraphicFramePr>
+            <a:graphic>
+              <a:graphicData uri="http://schemas.openxmlformats.org/drawingml/2006/picture">
+                <pic:pic>
+                  <pic:nvPicPr>
+                    <pic:cNvPr id="0" name="enc_dec_gold_agreement.png"/>
+                    <pic:cNvPicPr/>
+                  </pic:nvPicPr>
+                  <pic:blipFill>
+                    <a:blip r:embed="rId13"/>
+                    <a:stretch>
+                      <a:fillRect/>
+                    </a:stretch>
+                  </pic:blipFill>
+                  <pic:spPr>
+                    <a:xfrm>
+                      <a:off x="0" y="0"/>
+                      <a:ext cx="4572000" cy="1801091"/>
+                    </a:xfrm>
+                    <a:prstGeom prst="rect"/>
+                  </pic:spPr>
+                </pic:pic>
+              </a:graphicData>
+            </a:graphic>
+          </wp:inline>
+        </w:drawing>
+      </w:r>
+    </w:p>
+    <w:p>
+      <w:pPr>
+        <w:pStyle w:val="BodyText"/>
+        <w:jc w:val="center"/>
+      </w:pPr>
+      <w:r>
+        <w:drawing>
+          <wp:inline xmlns:a="http://schemas.openxmlformats.org/drawingml/2006/main" xmlns:pic="http://schemas.openxmlformats.org/drawingml/2006/picture">
+            <wp:extent cx="4572000" cy="2891928"/>
+            <wp:docPr id="8" name="Picture 8"/>
+            <wp:cNvGraphicFramePr>
+              <a:graphicFrameLocks noChangeAspect="1"/>
+            </wp:cNvGraphicFramePr>
+            <a:graphic>
+              <a:graphicData uri="http://schemas.openxmlformats.org/drawingml/2006/picture">
+                <pic:pic>
+                  <pic:nvPicPr>
+                    <pic:cNvPr id="0" name="enc_dec_agreement.png"/>
+                    <pic:cNvPicPr/>
+                  </pic:nvPicPr>
+                  <pic:blipFill>
+                    <a:blip r:embed="rId14"/>
+                    <a:stretch>
+                      <a:fillRect/>
+                    </a:stretch>
+                  </pic:blipFill>
+                  <pic:spPr>
+                    <a:xfrm>
+                      <a:off x="0" y="0"/>
+                      <a:ext cx="4572000" cy="2891928"/>
+                    </a:xfrm>
+                    <a:prstGeom prst="rect"/>
+                  </pic:spPr>
+                </pic:pic>
+              </a:graphicData>
+            </a:graphic>
+          </wp:inline>
+        </w:drawing>
       </w:r>
     </w:p>
     <w:p>
@@ -5279,6 +5295,17 @@
         <w:t>Distillation: teacher vs. student.</w:t>
       </w:r>
     </w:p>
+    <w:p>
+      <w:pPr>
+        <w:pStyle w:val="BodyText"/>
+      </w:pPr>
+      <w:r>
+        <w:rPr>
+          <w:i/>
+        </w:rPr>
+        <w:t>Final accuracy numbers for both models on n = 5,000 are in the fair comparison table (§3.1). The numbers above are from the preliminary n = 500 run.</w:t>
+      </w:r>
+    </w:p>
     <w:tbl>
       <w:tblPr>
         <w:tblStyle w:val="Table"/>
@@ -5480,34 +5507,9 @@
             <w:tcW w:w="0" w:type="auto"/>
           </w:tcPr>
           <w:p>
-            <w:pPr>
-              <w:pStyle w:val="Compact"/>
-            </w:pPr>
-            <m:oMathPara>
-              <m:oMath>
-                <m:r>
-                  <w:rPr>
-                    <w:rFonts w:ascii="Cambria Math" w:hAnsi="Cambria Math"/>
-                  </w:rPr>
-                  <m:t>n</m:t>
-                </m:r>
-                <m:r>
-                  <m:rPr>
-                    <m:sty m:val="p"/>
-                  </m:rPr>
-                  <w:rPr>
-                    <w:rFonts w:ascii="Cambria Math" w:hAnsi="Cambria Math"/>
-                  </w:rPr>
-                  <m:t>=</m:t>
-                </m:r>
-                <m:r>
-                  <w:rPr>
-                    <w:rFonts w:ascii="Cambria Math" w:hAnsi="Cambria Math"/>
-                  </w:rPr>
-                  <m:t>500</m:t>
-                </m:r>
-              </m:oMath>
-            </m:oMathPara>
+            <w:r>
+              <w:t>preliminary (n=500)</w:t>
+            </w:r>
           </w:p>
         </w:tc>
       </w:tr>
@@ -5807,6 +5809,17 @@
         <w:t>Decoder zero-shot vs. fine-tuned.</w:t>
       </w:r>
     </w:p>
+    <w:p>
+      <w:pPr>
+        <w:pStyle w:val="BodyText"/>
+      </w:pPr>
+      <w:r>
+        <w:rPr>
+          <w:i/>
+        </w:rPr>
+        <w:t>Final numbers for D1 and D1-ft on n = 5,000 are in the fair comparison table (§3.1).</w:t>
+      </w:r>
+    </w:p>
     <w:tbl>
       <w:tblPr>
         <w:tblStyle w:val="Table"/>
@@ -5975,11 +5988,8 @@
             <w:tcW w:w="0" w:type="auto"/>
           </w:tcPr>
           <w:p>
-            <w:pPr>
-              <w:pStyle w:val="Compact"/>
-            </w:pPr>
-            <w:r>
-              <w:t>degenerate</w:t>
+            <w:r>
+              <w:t>preliminary (n=200)</w:t>
             </w:r>
           </w:p>
         </w:tc>
@@ -6053,11 +6063,8 @@
             <w:tcW w:w="0" w:type="auto"/>
           </w:tcPr>
           <w:p>
-            <w:pPr>
-              <w:pStyle w:val="Compact"/>
-            </w:pPr>
-            <w:r>
-              <w:t>usable ranking</w:t>
+            <w:r>
+              <w:t>preliminary (n=200)</w:t>
             </w:r>
           </w:p>
         </w:tc>

</xml_diff>

<commit_message>
added mini fdr using fine-tune
</commit_message>
<xml_diff>
--- a/report/WordsThatHarm.docx
+++ b/report/WordsThatHarm.docx
@@ -6368,6 +6368,92 @@
     </w:p>
     <w:p>
       <w:pPr>
+        <w:pStyle w:val="Heading2"/>
+      </w:pPr>
+      <w:r>
+        <w:t>3.9</w:t>
+        <w:tab/>
+        <w:t>FPR-Regularized Fine-Tuning</w:t>
+      </w:r>
+    </w:p>
+    <w:p>
+      <w:pPr>
+        <w:pStyle w:val="FirstParagraph"/>
+      </w:pPr>
+      <w:r>
+        <w:rPr>
+          <w:b/>
+        </w:rPr>
+        <w:t xml:space="preserve">Goal. </w:t>
+      </w:r>
+      <w:r>
+        <w:rPr>
+          <w:b w:val="0"/>
+        </w:rPr>
+        <w:t>Reduce identity-probe FPR without destroying accuracy, using an explicit loss penalty rather than naive data masking.</w:t>
+      </w:r>
+    </w:p>
+    <w:p>
+      <w:pPr>
+        <w:pStyle w:val="BodyText"/>
+      </w:pPr>
+      <w:r>
+        <w:rPr>
+          <w:b/>
+        </w:rPr>
+        <w:t xml:space="preserve">Motivation. </w:t>
+      </w:r>
+      <w:r>
+        <w:rPr>
+          <w:b w:val="0"/>
+        </w:rPr>
+        <w:t>The masking experiment (§3.4) showed that identity bias is a lexical shortcut: removing the identity token at inference zeroes FPR, but removing it at training time hurts recall (0.78 → 0.68) with negligible fairness gain. We need a smarter approach that targets FPR directly in the training objective.</w:t>
+      </w:r>
+    </w:p>
+    <w:p>
+      <w:pPr>
+        <w:pStyle w:val="BodyText"/>
+      </w:pPr>
+      <w:r>
+        <w:rPr>
+          <w:b/>
+        </w:rPr>
+        <w:t xml:space="preserve">Method. </w:t>
+      </w:r>
+      <w:r>
+        <w:rPr>
+          <w:b w:val="0"/>
+        </w:rPr>
+        <w:t>Start from the trained distilbert-student (§3.6) and run a second-stage fine-tune with a combined loss: L = BCE(task batch) + γ · mean(sigmoid(probe_logits_toxic)), where the 230-sentence identity probe (§2.5) serves as the FPR penalty set. The BCE term preserves accuracy; the penalty pushes the model to predict probe sentences as non-toxic. We sweep γ ∈ {0.1, 0.5, 1.0, 2.0} with 2 epochs, 20k train examples, lr = 1e-5.</w:t>
+      </w:r>
+    </w:p>
+    <w:p>
+      <w:pPr>
+        <w:pStyle w:val="BodyText"/>
+      </w:pPr>
+      <w:r>
+        <w:t>Results. Placeholder—update after Colab run (notebooks/16_fpr_finetuning.ipynb).</w:t>
+      </w:r>
+    </w:p>
+    <w:p>
+      <w:pPr>
+        <w:pStyle w:val="BodyText"/>
+      </w:pPr>
+      <w:r>
+        <w:rPr>
+          <w:b/>
+        </w:rPr>
+        <w:t xml:space="preserve">Interpretation. </w:t>
+      </w:r>
+      <w:r>
+        <w:rPr>
+          <w:b w:val="0"/>
+        </w:rPr>
+        <w:t>(Pending results.) The hypothesis is that a moderate γ can push FPR toward zero while keeping F1 within ±0.01 of baseline—a much better tradeoff than naive masking, which sacrifices recall for negligible fairness improvement. If confirmed, FPR-regularized fine-tuning offers a practical debiasing recipe: train normally, then run a short second stage with the probe set in the loss.</w:t>
+      </w:r>
+    </w:p>
+    <w:p>
+      <w:pPr>
         <w:pStyle w:val="Heading1"/>
       </w:pPr>
       <w:bookmarkStart w:id="25" w:name="conclusions-and-future-work"/>
@@ -6506,6 +6592,12 @@
       </w:r>
     </w:p>
     <w:p>
+      <w:pPr/>
+      <w:r>
+        <w:t>FPR-regularized fine-tuning (§3.9): a second-stage loss penalty on the identity probe directly targets the bias mechanism identified by the masking experiment, offering a more principled fix than naive token removal.</w:t>
+      </w:r>
+    </w:p>
+    <w:p>
       <w:pPr>
         <w:pStyle w:val="FirstParagraph"/>
       </w:pPr>
@@ -6514,10 +6606,14 @@
           <w:b/>
           <w:bCs/>
         </w:rPr>
-        <w:t>Future work.</w:t>
-      </w:r>
-      <w:r>
-        <w:t xml:space="preserve"> Soft-F1 regularization during distillation to directly optimize the evaluation metric; calibration analysis (ECE, reliability diagrams); larger evaluation samples for tighter confidence intervals; hateBERT cross-domain probe; neural masked fine-tune of DistilBERT as a debiasing intervention.</w:t>
+        <w:t xml:space="preserve">Future work. </w:t>
+      </w:r>
+      <w:r/>
+      <w:r>
+        <w:rPr>
+          <w:b w:val="0"/>
+        </w:rPr>
+        <w:t>Calibration analysis (ECE, reliability diagrams); hateBERT cross-domain probe; extending FPR regularization to the encoder itself; fairness-constrained optimization with per-group FPR targets.</w:t>
       </w:r>
     </w:p>
     <w:p>

</xml_diff>

<commit_message>
window length fixes affects 1% of comments
DistilGPT2 has context window of 1024 tokens , this requires desicions
Token indices sequence length is longer than the specified maximum sequence length for this model (1068 > 1024). Running this sequence through the model will result in indexing errors
</commit_message>
<xml_diff>
--- a/report/WordsThatHarm.docx
+++ b/report/WordsThatHarm.docx
@@ -1870,6 +1870,117 @@
       </w:r>
       <w:r>
         <w:t xml:space="preserve"> Trained on 20k examples for 4 epochs.</w:t>
+      </w:r>
+    </w:p>
+    <w:p>
+      <w:pPr>
+        <w:pStyle w:val="BodyText"/>
+      </w:pPr>
+      <w:proofErr w:type="spellStart"/>
+      <w:proofErr w:type="spellEnd"/>
+      <m:oMath>
+        <m:r>
+          <w:rPr>
+            <w:rFonts w:ascii="Cambria Math" w:hAnsi="Cambria Math"/>
+            <w:color w:val="FF0000"/>
+          </w:rPr>
+          <m:t>T</m:t>
+        </m:r>
+        <m:r>
+          <m:rPr>
+            <m:sty m:val="p"/>
+          </m:rPr>
+          <w:rPr>
+            <w:rFonts w:ascii="Cambria Math" w:hAnsi="Cambria Math"/>
+            <w:color w:val="FF0000"/>
+          </w:rPr>
+          <m:t>=</m:t>
+        </m:r>
+        <m:r>
+          <w:rPr>
+            <w:rFonts w:ascii="Cambria Math" w:hAnsi="Cambria Math"/>
+            <w:color w:val="FF0000"/>
+          </w:rPr>
+          <m:t>2</m:t>
+        </m:r>
+      </m:oMath>
+      <m:oMath>
+        <m:r>
+          <w:rPr>
+            <w:rFonts w:ascii="Cambria Math" w:hAnsi="Cambria Math"/>
+            <w:color w:val="FF0000"/>
+          </w:rPr>
+          <m:t>α</m:t>
+        </m:r>
+        <m:r>
+          <m:rPr>
+            <m:sty m:val="p"/>
+          </m:rPr>
+          <w:rPr>
+            <w:rFonts w:ascii="Cambria Math" w:hAnsi="Cambria Math"/>
+            <w:color w:val="FF0000"/>
+          </w:rPr>
+          <m:t>=</m:t>
+        </m:r>
+        <m:r>
+          <w:rPr>
+            <w:rFonts w:ascii="Cambria Math" w:hAnsi="Cambria Math"/>
+            <w:color w:val="FF0000"/>
+          </w:rPr>
+          <m:t>0.7</m:t>
+        </m:r>
+      </m:oMath>
+      <m:oMath>
+        <m:r>
+          <w:rPr>
+            <w:rFonts w:ascii="Cambria Math" w:hAnsi="Cambria Math"/>
+            <w:color w:val="FF0000"/>
+          </w:rPr>
+          <m:t>1</m:t>
+        </m:r>
+        <m:r>
+          <m:rPr>
+            <m:sty m:val="p"/>
+          </m:rPr>
+          <w:rPr>
+            <w:rFonts w:ascii="Cambria Math" w:hAnsi="Cambria Math"/>
+            <w:color w:val="FF0000"/>
+          </w:rPr>
+          <m:t>-</m:t>
+        </m:r>
+        <m:r>
+          <w:rPr>
+            <w:rFonts w:ascii="Cambria Math" w:hAnsi="Cambria Math"/>
+            <w:color w:val="FF0000"/>
+          </w:rPr>
+          <m:t>α</m:t>
+        </m:r>
+        <m:r>
+          <m:rPr>
+            <m:sty m:val="p"/>
+          </m:rPr>
+          <w:rPr>
+            <w:rFonts w:ascii="Cambria Math" w:hAnsi="Cambria Math"/>
+            <w:color w:val="FF0000"/>
+          </w:rPr>
+          <m:t>=</m:t>
+        </m:r>
+        <m:r>
+          <w:rPr>
+            <w:rFonts w:ascii="Cambria Math" w:hAnsi="Cambria Math"/>
+            <w:color w:val="FF0000"/>
+          </w:rPr>
+          <m:t>0.3</m:t>
+        </m:r>
+      </m:oMath>
+      <w:r>
+        <w:rPr>
+          <w:b/>
+        </w:rPr>
+        <w:t xml:space="preserve">Decoder input truncation.</w:t>
+      </w:r>
+      <w:r>
+        <w:t xml:space="preserve"> DistilGPT-2 has a 1024-token context window (learned positional embeddings). When a long Jigsaw comment is wrapped in the D1 or D2 prompt template the total token count can exceed this limit. Tokens beyond position 1024 receive out-of-range positional indices, producing corrupted logits and unreliable scores. To prevent this, we truncate the tokenized prompt from the left so that prompt + continuation never exceeds 1024 tokens. Left-truncation preserves the tail of the prompt — the “Answer:” or “This comment is” suffix — which is the part the causal model conditions on when scoring the next token. The beginning of very long comments (roughly the top 1% of Jigsaw by length) is clipped, but the question/continuation tokens the model needs to make its prediction remain intact. Encoder models (BERT, DistilBERT) use a separate truncation=True parameter during tokenization and are unaffected.</w:t>
       </w:r>
     </w:p>
     <w:p>

</xml_diff>